<commit_message>
Rapor Son Hali 9
</commit_message>
<xml_diff>
--- a/Raporlar/9. Hafta.docx
+++ b/Raporlar/9. Hafta.docx
@@ -363,7 +363,7 @@
         <w:pStyle w:val="ListeParagraf"/>
         <w:numPr>
           <w:ilvl w:val="0"/>
-          <w:numId w:val="35"/>
+          <w:numId w:val="37"/>
         </w:numPr>
         <w:spacing w:after="0" w:line="240" w:lineRule="auto"/>
         <w:rPr>
@@ -382,6 +382,21 @@
         <w:pStyle w:val="ListeParagraf"/>
         <w:spacing w:after="0" w:line="240" w:lineRule="auto"/>
         <w:rPr>
+          <w:i/>
+        </w:rPr>
+      </w:pPr>
+      <w:r>
+        <w:rPr>
+          <w:i/>
+        </w:rPr>
+        <w:t>-- Kategori tablosunu oluşturuyor: Kitapların türlerini tutar</w:t>
+      </w:r>
+    </w:p>
+    <w:p>
+      <w:pPr>
+        <w:spacing w:after="0" w:line="240" w:lineRule="auto"/>
+        <w:ind w:left="720"/>
+        <w:rPr>
           <w:b/>
         </w:rPr>
       </w:pPr>
@@ -394,26 +409,50 @@
     </w:p>
     <w:p>
       <w:pPr>
-        <w:pStyle w:val="ListeParagraf"/>
-        <w:spacing w:after="0" w:line="240" w:lineRule="auto"/>
+        <w:spacing w:after="0" w:line="240" w:lineRule="auto"/>
+        <w:ind w:left="720"/>
       </w:pPr>
       <w:r>
         <w:t xml:space="preserve">    KategoriID SERIAL PRIMARY KEY,</w:t>
       </w:r>
-    </w:p>
-    <w:p>
-      <w:pPr>
-        <w:pStyle w:val="ListeParagraf"/>
-        <w:spacing w:after="0" w:line="240" w:lineRule="auto"/>
+      <w:r>
+        <w:tab/>
+      </w:r>
+      <w:r>
+        <w:tab/>
+      </w:r>
+      <w:r>
+        <w:rPr>
+          <w:i/>
+        </w:rPr>
+        <w:t>-- Otomatik artan birincil anahtar</w:t>
+      </w:r>
+    </w:p>
+    <w:p>
+      <w:pPr>
+        <w:spacing w:after="0" w:line="240" w:lineRule="auto"/>
+        <w:ind w:left="720"/>
       </w:pPr>
       <w:r>
         <w:t xml:space="preserve">    Turu VARCHAR(255) NOT NULL</w:t>
       </w:r>
-    </w:p>
-    <w:p>
-      <w:pPr>
-        <w:pStyle w:val="ListeParagraf"/>
-        <w:spacing w:after="0" w:line="240" w:lineRule="auto"/>
+      <w:r>
+        <w:tab/>
+      </w:r>
+      <w:r>
+        <w:tab/>
+      </w:r>
+      <w:r>
+        <w:rPr>
+          <w:i/>
+        </w:rPr>
+        <w:t>-- Kategorinin adı (zorunlu alan)</w:t>
+      </w:r>
+    </w:p>
+    <w:p>
+      <w:pPr>
+        <w:spacing w:after="0" w:line="240" w:lineRule="auto"/>
+        <w:ind w:left="720"/>
         <w:rPr>
           <w:b/>
         </w:rPr>
@@ -428,15 +467,22 @@
     <w:p>
       <w:pPr>
         <w:spacing w:after="0" w:line="240" w:lineRule="auto"/>
-        <w:rPr>
-          <w:b/>
-        </w:rPr>
-      </w:pPr>
-    </w:p>
-    <w:p>
-      <w:pPr>
-        <w:pStyle w:val="ListeParagraf"/>
-        <w:spacing w:after="0" w:line="240" w:lineRule="auto"/>
+        <w:ind w:left="720"/>
+        <w:rPr>
+          <w:i/>
+        </w:rPr>
+      </w:pPr>
+      <w:r>
+        <w:rPr>
+          <w:i/>
+        </w:rPr>
+        <w:t>-- Yazar tablosunu oluşturuyor: Kitap yazarlarının bilgilerini tutar</w:t>
+      </w:r>
+    </w:p>
+    <w:p>
+      <w:pPr>
+        <w:spacing w:after="0" w:line="240" w:lineRule="auto"/>
+        <w:ind w:left="720"/>
         <w:rPr>
           <w:b/>
         </w:rPr>
@@ -450,8 +496,8 @@
     </w:p>
     <w:p>
       <w:pPr>
-        <w:pStyle w:val="ListeParagraf"/>
-        <w:spacing w:after="0" w:line="240" w:lineRule="auto"/>
+        <w:spacing w:after="0" w:line="240" w:lineRule="auto"/>
+        <w:ind w:left="720"/>
       </w:pPr>
       <w:r>
         <w:t xml:space="preserve">    YazarID SERIAL PRIMARY KEY,</w:t>
@@ -459,8 +505,8 @@
     </w:p>
     <w:p>
       <w:pPr>
-        <w:pStyle w:val="ListeParagraf"/>
-        <w:spacing w:after="0" w:line="240" w:lineRule="auto"/>
+        <w:spacing w:after="0" w:line="240" w:lineRule="auto"/>
+        <w:ind w:left="720"/>
       </w:pPr>
       <w:r>
         <w:t xml:space="preserve">    YazarAdi VARCHAR(255) NOT NULL,</w:t>
@@ -468,8 +514,8 @@
     </w:p>
     <w:p>
       <w:pPr>
-        <w:pStyle w:val="ListeParagraf"/>
-        <w:spacing w:after="0" w:line="240" w:lineRule="auto"/>
+        <w:spacing w:after="0" w:line="240" w:lineRule="auto"/>
+        <w:ind w:left="720"/>
       </w:pPr>
       <w:r>
         <w:t xml:space="preserve">    YazarSoyad VARCHAR(255) NOT NULL</w:t>
@@ -477,8 +523,8 @@
     </w:p>
     <w:p>
       <w:pPr>
-        <w:pStyle w:val="ListeParagraf"/>
-        <w:spacing w:after="0" w:line="240" w:lineRule="auto"/>
+        <w:spacing w:after="0" w:line="240" w:lineRule="auto"/>
+        <w:ind w:left="720"/>
         <w:rPr>
           <w:b/>
         </w:rPr>
@@ -493,15 +539,109 @@
     <w:p>
       <w:pPr>
         <w:spacing w:after="0" w:line="240" w:lineRule="auto"/>
-        <w:rPr>
-          <w:b/>
-        </w:rPr>
-      </w:pPr>
-    </w:p>
-    <w:p>
-      <w:pPr>
-        <w:pStyle w:val="ListeParagraf"/>
-        <w:spacing w:after="0" w:line="240" w:lineRule="auto"/>
+        <w:ind w:left="720"/>
+      </w:pPr>
+      <w:r>
+        <w:rPr>
+          <w:i/>
+        </w:rPr>
+        <w:t>-- Raf tablosunu oluşturuyor: Kütüphane raflarının bilgilerini tutar.</w:t>
+      </w:r>
+    </w:p>
+    <w:p>
+      <w:pPr>
+        <w:spacing w:after="0" w:line="240" w:lineRule="auto"/>
+        <w:ind w:left="720"/>
+        <w:rPr>
+          <w:b/>
+        </w:rPr>
+      </w:pPr>
+      <w:r>
+        <w:rPr>
+          <w:b/>
+        </w:rPr>
+        <w:t>CREATE TABLE Raf (</w:t>
+      </w:r>
+    </w:p>
+    <w:p>
+      <w:pPr>
+        <w:spacing w:after="0" w:line="240" w:lineRule="auto"/>
+        <w:ind w:left="720"/>
+      </w:pPr>
+      <w:r>
+        <w:t xml:space="preserve">    RafNo VARCHAR(50) PRIMARY KEY,</w:t>
+      </w:r>
+      <w:r>
+        <w:tab/>
+      </w:r>
+      <w:r>
+        <w:tab/>
+      </w:r>
+      <w:r>
+        <w:rPr>
+          <w:i/>
+        </w:rPr>
+        <w:t>-- Raf numarası (birincil anahtar)</w:t>
+      </w:r>
+    </w:p>
+    <w:p>
+      <w:pPr>
+        <w:spacing w:after="0" w:line="240" w:lineRule="auto"/>
+        <w:ind w:left="720"/>
+      </w:pPr>
+      <w:r>
+        <w:t xml:space="preserve">    Bolum VARCHAR(255) NOT NULL</w:t>
+      </w:r>
+      <w:r>
+        <w:tab/>
+      </w:r>
+      <w:r>
+        <w:tab/>
+      </w:r>
+      <w:r>
+        <w:rPr>
+          <w:i/>
+        </w:rPr>
+        <w:t>-- Rafın bulunduğu bölümün adı</w:t>
+      </w:r>
+      <w:r>
+        <w:t xml:space="preserve"> (zorunlu alan)</w:t>
+      </w:r>
+    </w:p>
+    <w:p>
+      <w:pPr>
+        <w:spacing w:after="0" w:line="240" w:lineRule="auto"/>
+        <w:ind w:left="720"/>
+        <w:rPr>
+          <w:b/>
+        </w:rPr>
+      </w:pPr>
+      <w:r>
+        <w:rPr>
+          <w:b/>
+        </w:rPr>
+        <w:t>);</w:t>
+      </w:r>
+    </w:p>
+    <w:p>
+      <w:pPr>
+        <w:spacing w:after="0" w:line="240" w:lineRule="auto"/>
+        <w:ind w:left="720"/>
+        <w:rPr>
+          <w:i/>
+        </w:rPr>
+      </w:pPr>
+      <w:r>
+        <w:rPr>
+          <w:i/>
+        </w:rPr>
+        <w:t>-- Kitap tablosunu oluşturuyor: Kütüphanedeki kitapların bilgilerini tutar</w:t>
+      </w:r>
+    </w:p>
+    <w:p>
+      <w:pPr>
+        <w:spacing w:after="0" w:line="240" w:lineRule="auto"/>
+        <w:ind w:left="720"/>
         <w:rPr>
           <w:b/>
         </w:rPr>
@@ -515,89 +655,200 @@
     </w:p>
     <w:p>
       <w:pPr>
-        <w:pStyle w:val="ListeParagraf"/>
-        <w:spacing w:after="0" w:line="240" w:lineRule="auto"/>
+        <w:spacing w:after="0" w:line="240" w:lineRule="auto"/>
+        <w:ind w:left="720"/>
       </w:pPr>
       <w:r>
         <w:t xml:space="preserve">    KitapID SERIAL PRIMARY KEY,</w:t>
       </w:r>
-    </w:p>
-    <w:p>
-      <w:pPr>
-        <w:pStyle w:val="ListeParagraf"/>
-        <w:spacing w:after="0" w:line="240" w:lineRule="auto"/>
+      <w:r>
+        <w:tab/>
+      </w:r>
+      <w:r>
+        <w:tab/>
+      </w:r>
+      <w:r>
+        <w:tab/>
+      </w:r>
+      <w:r>
+        <w:rPr>
+          <w:i/>
+        </w:rPr>
+        <w:t>-- Otomatik artan birincil anahtar</w:t>
+      </w:r>
+    </w:p>
+    <w:p>
+      <w:pPr>
+        <w:spacing w:after="0" w:line="240" w:lineRule="auto"/>
+        <w:ind w:left="720"/>
       </w:pPr>
       <w:r>
         <w:t xml:space="preserve">    KitapAdi VARCHAR(255) NOT NULL,</w:t>
       </w:r>
-    </w:p>
-    <w:p>
-      <w:pPr>
-        <w:pStyle w:val="ListeParagraf"/>
-        <w:spacing w:after="0" w:line="240" w:lineRule="auto"/>
+      <w:r>
+        <w:tab/>
+      </w:r>
+      <w:r>
+        <w:tab/>
+      </w:r>
+      <w:r>
+        <w:rPr>
+          <w:i/>
+        </w:rPr>
+        <w:t>-- Kitap adı (zorunlu alan)</w:t>
+      </w:r>
+    </w:p>
+    <w:p>
+      <w:pPr>
+        <w:spacing w:after="0" w:line="240" w:lineRule="auto"/>
+        <w:ind w:left="720"/>
       </w:pPr>
       <w:r>
         <w:t xml:space="preserve">    ISBN VARCHAR(13) UNIQUE NOT NULL,</w:t>
       </w:r>
-    </w:p>
-    <w:p>
-      <w:pPr>
-        <w:pStyle w:val="ListeParagraf"/>
-        <w:spacing w:after="0" w:line="240" w:lineRule="auto"/>
+      <w:r>
+        <w:tab/>
+      </w:r>
+      <w:r>
+        <w:rPr>
+          <w:i/>
+        </w:rPr>
+        <w:t>-- Kitabın benzersiz ISBN numarası</w:t>
+      </w:r>
+    </w:p>
+    <w:p>
+      <w:pPr>
+        <w:spacing w:after="0" w:line="240" w:lineRule="auto"/>
+        <w:ind w:left="720"/>
+        <w:rPr>
+          <w:i/>
+        </w:rPr>
       </w:pPr>
       <w:r>
         <w:t xml:space="preserve">    BasimYili DATE NOT NULL,</w:t>
       </w:r>
-    </w:p>
-    <w:p>
-      <w:pPr>
-        <w:pStyle w:val="ListeParagraf"/>
-        <w:spacing w:after="0" w:line="240" w:lineRule="auto"/>
+      <w:r>
+        <w:tab/>
+      </w:r>
+      <w:r>
+        <w:tab/>
+      </w:r>
+      <w:r>
+        <w:tab/>
+      </w:r>
+      <w:r>
+        <w:rPr>
+          <w:i/>
+        </w:rPr>
+        <w:t>-- Kitabın basım yılı</w:t>
+      </w:r>
+    </w:p>
+    <w:p>
+      <w:pPr>
+        <w:spacing w:after="0" w:line="240" w:lineRule="auto"/>
+        <w:ind w:left="720"/>
       </w:pPr>
       <w:r>
         <w:t xml:space="preserve">    Yayinevi VARCHAR(255),</w:t>
       </w:r>
-    </w:p>
-    <w:p>
-      <w:pPr>
-        <w:pStyle w:val="ListeParagraf"/>
-        <w:spacing w:after="0" w:line="240" w:lineRule="auto"/>
-      </w:pPr>
-      <w:r>
-        <w:t xml:space="preserve">    Adet INT NOT NULL,</w:t>
-      </w:r>
-    </w:p>
-    <w:p>
-      <w:pPr>
-        <w:pStyle w:val="ListeParagraf"/>
-        <w:spacing w:after="0" w:line="240" w:lineRule="auto"/>
+      <w:r>
+        <w:tab/>
+      </w:r>
+      <w:r>
+        <w:tab/>
+      </w:r>
+      <w:r>
+        <w:tab/>
+      </w:r>
+      <w:r>
+        <w:rPr>
+          <w:i/>
+        </w:rPr>
+        <w:t>-- Kitabı yayınlayan yayınevi</w:t>
+      </w:r>
+    </w:p>
+    <w:p>
+      <w:pPr>
+        <w:spacing w:after="0" w:line="240" w:lineRule="auto"/>
+        <w:ind w:left="720"/>
+      </w:pPr>
+      <w:r>
+        <w:t xml:space="preserve">    </w:t>
+      </w:r>
+      <w:r>
+        <w:t xml:space="preserve">Adet INT NOT NULL CHECK ("ADET" &gt;= 0),  </w:t>
+      </w:r>
+      <w:r>
+        <w:tab/>
+      </w:r>
+      <w:r>
+        <w:rPr>
+          <w:i/>
+        </w:rPr>
+        <w:t>-- Kitabın mevcut adedi</w:t>
+      </w:r>
+    </w:p>
+    <w:p>
+      <w:pPr>
+        <w:spacing w:after="0" w:line="240" w:lineRule="auto"/>
+        <w:ind w:left="720"/>
       </w:pPr>
       <w:r>
         <w:t xml:space="preserve">    KategoriID INT REFERENCES Kategori(KategoriID) ON DELETE SET NULL,</w:t>
       </w:r>
-    </w:p>
-    <w:p>
-      <w:pPr>
-        <w:pStyle w:val="ListeParagraf"/>
-        <w:spacing w:after="0" w:line="240" w:lineRule="auto"/>
+      <w:r>
+        <w:rPr>
+          <w:i/>
+        </w:rPr>
+        <w:t>-- Kitabın kategorisi</w:t>
+      </w:r>
+    </w:p>
+    <w:p>
+      <w:pPr>
+        <w:spacing w:after="0" w:line="240" w:lineRule="auto"/>
+        <w:ind w:left="720"/>
       </w:pPr>
       <w:r>
         <w:t xml:space="preserve">    YazarID INT REFERENCES Yazar(YazarID) ON DELETE SET NULL,</w:t>
       </w:r>
-    </w:p>
-    <w:p>
-      <w:pPr>
-        <w:pStyle w:val="ListeParagraf"/>
-        <w:spacing w:after="0" w:line="240" w:lineRule="auto"/>
+      <w:r>
+        <w:tab/>
+      </w:r>
+      <w:r>
+        <w:t xml:space="preserve">              </w:t>
+      </w:r>
+      <w:r>
+        <w:t xml:space="preserve"> </w:t>
+      </w:r>
+      <w:r>
+        <w:rPr>
+          <w:i/>
+        </w:rPr>
+        <w:t>-- Kitabın yazarı</w:t>
+      </w:r>
+    </w:p>
+    <w:p>
+      <w:pPr>
+        <w:spacing w:after="0" w:line="240" w:lineRule="auto"/>
+        <w:ind w:left="720"/>
       </w:pPr>
       <w:r>
         <w:t xml:space="preserve">    RafNo VARCHAR(50) REFERENCES Raf(RafNo) ON DELETE SET NULL</w:t>
       </w:r>
-    </w:p>
-    <w:p>
-      <w:pPr>
-        <w:pStyle w:val="ListeParagraf"/>
-        <w:spacing w:after="0" w:line="240" w:lineRule="auto"/>
+      <w:r>
+        <w:tab/>
+      </w:r>
+      <w:r>
+        <w:rPr>
+          <w:i/>
+        </w:rPr>
+        <w:t>-- Kitabın bulunduğu raf</w:t>
+      </w:r>
+    </w:p>
+    <w:p>
+      <w:pPr>
+        <w:spacing w:after="0" w:line="240" w:lineRule="auto"/>
+        <w:ind w:left="720"/>
         <w:rPr>
           <w:b/>
         </w:rPr>
@@ -612,48 +863,178 @@
     <w:p>
       <w:pPr>
         <w:spacing w:after="0" w:line="240" w:lineRule="auto"/>
-        <w:rPr>
-          <w:b/>
-        </w:rPr>
-      </w:pPr>
-    </w:p>
-    <w:p>
-      <w:pPr>
-        <w:pStyle w:val="ListeParagraf"/>
-        <w:spacing w:after="0" w:line="240" w:lineRule="auto"/>
-        <w:rPr>
-          <w:b/>
-        </w:rPr>
-      </w:pPr>
-      <w:r>
-        <w:rPr>
-          <w:b/>
-        </w:rPr>
-        <w:t>CREATE TABLE Raf (</w:t>
-      </w:r>
-    </w:p>
-    <w:p>
-      <w:pPr>
-        <w:pStyle w:val="ListeParagraf"/>
-        <w:spacing w:after="0" w:line="240" w:lineRule="auto"/>
-      </w:pPr>
-      <w:r>
-        <w:t xml:space="preserve">    RafNo VARCHAR(50) PRIMARY KEY,</w:t>
-      </w:r>
-    </w:p>
-    <w:p>
-      <w:pPr>
-        <w:pStyle w:val="ListeParagraf"/>
-        <w:spacing w:after="0" w:line="240" w:lineRule="auto"/>
-      </w:pPr>
-      <w:r>
-        <w:t xml:space="preserve">    Bolum VARCHAR(255) NOT NULL</w:t>
-      </w:r>
-    </w:p>
-    <w:p>
-      <w:pPr>
-        <w:pStyle w:val="ListeParagraf"/>
-        <w:spacing w:after="0" w:line="240" w:lineRule="auto"/>
+        <w:ind w:left="720"/>
+        <w:rPr>
+          <w:i/>
+        </w:rPr>
+      </w:pPr>
+      <w:r>
+        <w:rPr>
+          <w:i/>
+        </w:rPr>
+        <w:t>-- Üye tablosunu oluşturuyor: Kütüphaneye kayıtlı üyelerin bilgilerini tutar.</w:t>
+      </w:r>
+    </w:p>
+    <w:p>
+      <w:pPr>
+        <w:spacing w:after="0" w:line="240" w:lineRule="auto"/>
+        <w:ind w:left="720"/>
+        <w:rPr>
+          <w:b/>
+        </w:rPr>
+      </w:pPr>
+      <w:r>
+        <w:rPr>
+          <w:b/>
+        </w:rPr>
+        <w:t>CREATE TABLE Uye (</w:t>
+      </w:r>
+    </w:p>
+    <w:p>
+      <w:pPr>
+        <w:spacing w:after="0" w:line="240" w:lineRule="auto"/>
+        <w:ind w:left="720"/>
+      </w:pPr>
+      <w:r>
+        <w:t xml:space="preserve">    UyeID SERIAL PRIMARY KEY,</w:t>
+      </w:r>
+      <w:r>
+        <w:tab/>
+      </w:r>
+      <w:r>
+        <w:tab/>
+      </w:r>
+      <w:r>
+        <w:tab/>
+      </w:r>
+      <w:r>
+        <w:rPr>
+          <w:i/>
+        </w:rPr>
+        <w:t>-- Otomatik artan birincil anahtar</w:t>
+      </w:r>
+    </w:p>
+    <w:p>
+      <w:pPr>
+        <w:spacing w:after="0" w:line="240" w:lineRule="auto"/>
+        <w:ind w:left="720"/>
+      </w:pPr>
+      <w:r>
+        <w:t xml:space="preserve">    UyeAdi VARCHAR(255) NOT NULL,</w:t>
+      </w:r>
+      <w:r>
+        <w:tab/>
+      </w:r>
+      <w:r>
+        <w:tab/>
+      </w:r>
+      <w:r>
+        <w:rPr>
+          <w:i/>
+        </w:rPr>
+        <w:t>-- Üyenin adı (zorunlu alan)</w:t>
+      </w:r>
+    </w:p>
+    <w:p>
+      <w:pPr>
+        <w:spacing w:after="0" w:line="240" w:lineRule="auto"/>
+        <w:ind w:left="720"/>
+      </w:pPr>
+      <w:r>
+        <w:t xml:space="preserve">    UyeSoyad VARCHAR(255) NOT NULL,</w:t>
+      </w:r>
+      <w:r>
+        <w:tab/>
+      </w:r>
+      <w:r>
+        <w:tab/>
+      </w:r>
+      <w:r>
+        <w:rPr>
+          <w:i/>
+        </w:rPr>
+        <w:t>-- Üyenin soyadı (zorunlu alan)</w:t>
+      </w:r>
+    </w:p>
+    <w:p>
+      <w:pPr>
+        <w:spacing w:after="0" w:line="240" w:lineRule="auto"/>
+        <w:ind w:left="720"/>
+      </w:pPr>
+      <w:r>
+        <w:t xml:space="preserve">    Email VARCHAR(255) UNIQUE,</w:t>
+      </w:r>
+      <w:r>
+        <w:tab/>
+      </w:r>
+      <w:r>
+        <w:tab/>
+      </w:r>
+      <w:r>
+        <w:rPr>
+          <w:i/>
+        </w:rPr>
+        <w:t>-- Üyenin benzersiz e-posta adresi</w:t>
+      </w:r>
+    </w:p>
+    <w:p>
+      <w:pPr>
+        <w:spacing w:after="0" w:line="240" w:lineRule="auto"/>
+        <w:ind w:left="720"/>
+      </w:pPr>
+      <w:r>
+        <w:t xml:space="preserve">    TelNo VARCHAR(15) UNIQUE,</w:t>
+      </w:r>
+      <w:r>
+        <w:tab/>
+      </w:r>
+      <w:r>
+        <w:tab/>
+      </w:r>
+      <w:r>
+        <w:tab/>
+      </w:r>
+      <w:r>
+        <w:rPr>
+          <w:i/>
+        </w:rPr>
+        <w:t>-- Üyenin benzersiz telefon numarası</w:t>
+      </w:r>
+    </w:p>
+    <w:p>
+      <w:pPr>
+        <w:spacing w:after="0" w:line="240" w:lineRule="auto"/>
+        <w:ind w:left="720"/>
+      </w:pPr>
+      <w:r>
+        <w:t xml:space="preserve">    Adres TEXT</w:t>
+      </w:r>
+      <w:r>
+        <w:tab/>
+      </w:r>
+      <w:r>
+        <w:tab/>
+      </w:r>
+      <w:r>
+        <w:tab/>
+      </w:r>
+      <w:r>
+        <w:tab/>
+      </w:r>
+      <w:r>
+        <w:tab/>
+      </w:r>
+      <w:r>
+        <w:rPr>
+          <w:i/>
+        </w:rPr>
+        <w:t>-- Üyenin adres bilgisi</w:t>
+      </w:r>
+    </w:p>
+    <w:p>
+      <w:pPr>
+        <w:spacing w:after="0" w:line="240" w:lineRule="auto"/>
+        <w:ind w:left="720"/>
         <w:rPr>
           <w:b/>
         </w:rPr>
@@ -668,93 +1049,208 @@
     <w:p>
       <w:pPr>
         <w:spacing w:after="0" w:line="240" w:lineRule="auto"/>
-        <w:rPr>
-          <w:b/>
-        </w:rPr>
-      </w:pPr>
-    </w:p>
-    <w:p>
-      <w:pPr>
-        <w:pStyle w:val="ListeParagraf"/>
-        <w:spacing w:after="0" w:line="240" w:lineRule="auto"/>
-        <w:rPr>
-          <w:b/>
-        </w:rPr>
-      </w:pPr>
-      <w:r>
-        <w:rPr>
-          <w:b/>
-        </w:rPr>
-        <w:t>CREATE TABLE Uye (</w:t>
-      </w:r>
-    </w:p>
-    <w:p>
-      <w:pPr>
-        <w:pStyle w:val="ListeParagraf"/>
-        <w:spacing w:after="0" w:line="240" w:lineRule="auto"/>
-      </w:pPr>
-      <w:r>
-        <w:t xml:space="preserve">    UyeID SERIAL PRIMARY KEY,</w:t>
-      </w:r>
-    </w:p>
-    <w:p>
-      <w:pPr>
-        <w:pStyle w:val="ListeParagraf"/>
-        <w:spacing w:after="0" w:line="240" w:lineRule="auto"/>
-      </w:pPr>
-      <w:r>
-        <w:t xml:space="preserve">    UyeAdi VARCHAR(255) NOT NULL,</w:t>
-      </w:r>
-    </w:p>
-    <w:p>
-      <w:pPr>
-        <w:pStyle w:val="ListeParagraf"/>
-        <w:spacing w:after="0" w:line="240" w:lineRule="auto"/>
-      </w:pPr>
-      <w:r>
-        <w:t xml:space="preserve">    UyeSoyad VARCHAR(255) NOT NULL,</w:t>
-      </w:r>
-    </w:p>
-    <w:p>
-      <w:pPr>
-        <w:pStyle w:val="ListeParagraf"/>
-        <w:spacing w:after="0" w:line="240" w:lineRule="auto"/>
-      </w:pPr>
-      <w:r>
-        <w:t xml:space="preserve">    Email VARCHAR(255) UNIQUE,</w:t>
-      </w:r>
-    </w:p>
-    <w:p>
-      <w:pPr>
-        <w:pStyle w:val="ListeParagraf"/>
-        <w:spacing w:after="0" w:line="240" w:lineRule="auto"/>
-      </w:pPr>
-      <w:r>
-        <w:t xml:space="preserve">    TelNo VARCHAR(15),</w:t>
-      </w:r>
-    </w:p>
-    <w:p>
-      <w:pPr>
-        <w:pStyle w:val="ListeParagraf"/>
-        <w:spacing w:after="0" w:line="240" w:lineRule="auto"/>
-      </w:pPr>
-      <w:r>
-        <w:t xml:space="preserve">    KayitTarih DATE DEFAULT CURRENT_DATE,</w:t>
-      </w:r>
-    </w:p>
-    <w:p>
-      <w:pPr>
-        <w:pStyle w:val="ListeParagraf"/>
-        <w:spacing w:after="0" w:line="240" w:lineRule="auto"/>
-      </w:pPr>
-      <w:r>
-        <w:t xml:space="preserve">    Adres TEXT</w:t>
-      </w:r>
-    </w:p>
-    <w:p>
-      <w:pPr>
-        <w:pStyle w:val="ListeParagraf"/>
-        <w:spacing w:after="0" w:line="240" w:lineRule="auto"/>
+        <w:ind w:left="720"/>
+        <w:rPr>
+          <w:b/>
+        </w:rPr>
+      </w:pPr>
+    </w:p>
+    <w:p>
+      <w:pPr>
+        <w:spacing w:after="0" w:line="240" w:lineRule="auto"/>
+        <w:ind w:left="720"/>
+        <w:rPr>
+          <w:b/>
+        </w:rPr>
+      </w:pPr>
+    </w:p>
+    <w:p>
+      <w:pPr>
+        <w:spacing w:after="0" w:line="240" w:lineRule="auto"/>
+        <w:ind w:left="720"/>
+        <w:rPr>
+          <w:i/>
+        </w:rPr>
+      </w:pPr>
+      <w:r>
+        <w:rPr>
+          <w:i/>
+        </w:rPr>
+        <w:lastRenderedPageBreak/>
+        <w:t>-- Personel tablosunu oluşturuyor: Kütüphane çalışanlarının bilgilerini tutar.</w:t>
+      </w:r>
+    </w:p>
+    <w:p>
+      <w:pPr>
+        <w:spacing w:after="0" w:line="240" w:lineRule="auto"/>
+        <w:ind w:left="720"/>
+        <w:rPr>
+          <w:b/>
+        </w:rPr>
+      </w:pPr>
+      <w:r>
+        <w:rPr>
+          <w:b/>
+        </w:rPr>
+        <w:t>CREATE TABLE Personel (</w:t>
+      </w:r>
+    </w:p>
+    <w:p>
+      <w:pPr>
+        <w:spacing w:after="0" w:line="240" w:lineRule="auto"/>
+        <w:ind w:left="720"/>
+      </w:pPr>
+      <w:r>
+        <w:t xml:space="preserve">    PersonelID SERIAL PRIMARY KEY,    </w:t>
+      </w:r>
+      <w:r>
+        <w:tab/>
+      </w:r>
+      <w:r>
+        <w:tab/>
+      </w:r>
+      <w:r>
+        <w:tab/>
+      </w:r>
+      <w:r>
+        <w:t xml:space="preserve"> </w:t>
+      </w:r>
+      <w:r>
+        <w:rPr>
+          <w:i/>
+        </w:rPr>
+        <w:t>-- Otomatik artan birincil anahtar</w:t>
+      </w:r>
+    </w:p>
+    <w:p>
+      <w:pPr>
+        <w:spacing w:after="0" w:line="240" w:lineRule="auto"/>
+        <w:ind w:left="720"/>
+      </w:pPr>
+      <w:r>
+        <w:t xml:space="preserve">    PerAdi VARCHAR(255) NOT NULL,    </w:t>
+      </w:r>
+      <w:r>
+        <w:tab/>
+      </w:r>
+      <w:r>
+        <w:tab/>
+      </w:r>
+      <w:r>
+        <w:tab/>
+        <w:t xml:space="preserve"> </w:t>
+      </w:r>
+      <w:r>
+        <w:rPr>
+          <w:i/>
+        </w:rPr>
+        <w:t>-- Personelin adı (zorunlu alan)</w:t>
+      </w:r>
+    </w:p>
+    <w:p>
+      <w:pPr>
+        <w:spacing w:after="0" w:line="240" w:lineRule="auto"/>
+        <w:ind w:left="720"/>
+        <w:rPr>
+          <w:i/>
+        </w:rPr>
+      </w:pPr>
+      <w:r>
+        <w:t xml:space="preserve">    PerSoyad VARCHAR(255) NOT NULL,   </w:t>
+      </w:r>
+      <w:r>
+        <w:tab/>
+      </w:r>
+      <w:r>
+        <w:tab/>
+      </w:r>
+      <w:r>
+        <w:tab/>
+      </w:r>
+      <w:r>
+        <w:rPr>
+          <w:i/>
+        </w:rPr>
+        <w:t xml:space="preserve"> -- Personelin soyadı (zorunlu alan)</w:t>
+      </w:r>
+    </w:p>
+    <w:p>
+      <w:pPr>
+        <w:spacing w:after="0" w:line="240" w:lineRule="auto"/>
+        <w:ind w:left="720"/>
+      </w:pPr>
+      <w:r>
+        <w:t xml:space="preserve">    TelNo VARCHAR(15) UNIQUE,         </w:t>
+      </w:r>
+      <w:r>
+        <w:tab/>
+      </w:r>
+      <w:r>
+        <w:tab/>
+      </w:r>
+      <w:r>
+        <w:tab/>
+      </w:r>
+      <w:r>
+        <w:t xml:space="preserve"> </w:t>
+      </w:r>
+      <w:r>
+        <w:rPr>
+          <w:i/>
+        </w:rPr>
+        <w:t>-- Personelin telefon numarası</w:t>
+      </w:r>
+    </w:p>
+    <w:p>
+      <w:pPr>
+        <w:spacing w:after="0" w:line="240" w:lineRule="auto"/>
+        <w:ind w:left="720"/>
+      </w:pPr>
+      <w:r>
+        <w:t xml:space="preserve">    Email VARCHAR(255) UNIQUE,         </w:t>
+      </w:r>
+      <w:r>
+        <w:tab/>
+      </w:r>
+      <w:r>
+        <w:tab/>
+      </w:r>
+      <w:r>
+        <w:tab/>
+        <w:t xml:space="preserve"> </w:t>
+      </w:r>
+      <w:r>
+        <w:rPr>
+          <w:i/>
+        </w:rPr>
+        <w:t>-- Personelin e-posta adresi</w:t>
+      </w:r>
+    </w:p>
+    <w:p>
+      <w:pPr>
+        <w:spacing w:after="0" w:line="240" w:lineRule="auto"/>
+        <w:ind w:left="720"/>
+      </w:pPr>
+      <w:r>
+        <w:t xml:space="preserve">    IsBaslamaTarih DATE DEFAULT CURRENT_DATE</w:t>
+      </w:r>
+      <w:r>
+        <w:tab/>
+      </w:r>
+      <w:r>
+        <w:t xml:space="preserve"> </w:t>
+      </w:r>
+      <w:r>
+        <w:rPr>
+          <w:i/>
+        </w:rPr>
+        <w:t>-- Personelin işe başlama tarihi</w:t>
+      </w:r>
+    </w:p>
+    <w:p>
+      <w:pPr>
+        <w:spacing w:after="0" w:line="240" w:lineRule="auto"/>
+        <w:ind w:left="720"/>
         <w:rPr>
           <w:b/>
         </w:rPr>
@@ -769,93 +1265,121 @@
     <w:p>
       <w:pPr>
         <w:spacing w:after="0" w:line="240" w:lineRule="auto"/>
-        <w:rPr>
-          <w:b/>
-        </w:rPr>
-      </w:pPr>
-    </w:p>
-    <w:p>
-      <w:pPr>
-        <w:spacing w:after="0" w:line="240" w:lineRule="auto"/>
-        <w:rPr>
-          <w:b/>
-        </w:rPr>
-      </w:pPr>
-    </w:p>
-    <w:p>
-      <w:pPr>
-        <w:pStyle w:val="ListeParagraf"/>
-        <w:spacing w:after="0" w:line="240" w:lineRule="auto"/>
-        <w:rPr>
-          <w:b/>
-        </w:rPr>
-      </w:pPr>
-      <w:r>
-        <w:rPr>
-          <w:b/>
-        </w:rPr>
-        <w:lastRenderedPageBreak/>
-        <w:t>CREATE TABLE Personel (</w:t>
-      </w:r>
-    </w:p>
-    <w:p>
-      <w:pPr>
-        <w:pStyle w:val="ListeParagraf"/>
-        <w:spacing w:after="0" w:line="240" w:lineRule="auto"/>
-      </w:pPr>
-      <w:r>
-        <w:t xml:space="preserve">    PersonelID SERIAL PRIMARY KEY,</w:t>
-      </w:r>
-    </w:p>
-    <w:p>
-      <w:pPr>
-        <w:pStyle w:val="ListeParagraf"/>
-        <w:spacing w:after="0" w:line="240" w:lineRule="auto"/>
-      </w:pPr>
-      <w:r>
-        <w:t xml:space="preserve">    PerAdi VARCHAR(255) NOT NULL,</w:t>
-      </w:r>
-    </w:p>
-    <w:p>
-      <w:pPr>
-        <w:pStyle w:val="ListeParagraf"/>
-        <w:spacing w:after="0" w:line="240" w:lineRule="auto"/>
-      </w:pPr>
-      <w:r>
-        <w:t xml:space="preserve">    PerSoyad VARCHAR(255) NOT NULL,</w:t>
-      </w:r>
-    </w:p>
-    <w:p>
-      <w:pPr>
-        <w:pStyle w:val="ListeParagraf"/>
-        <w:spacing w:after="0" w:line="240" w:lineRule="auto"/>
-      </w:pPr>
-      <w:r>
-        <w:t xml:space="preserve">    TelNo VARCHAR(15),</w:t>
-      </w:r>
-    </w:p>
-    <w:p>
-      <w:pPr>
-        <w:pStyle w:val="ListeParagraf"/>
-        <w:spacing w:after="0" w:line="240" w:lineRule="auto"/>
-      </w:pPr>
-      <w:r>
-        <w:t xml:space="preserve">    Email VARCHAR(255) UNIQUE,</w:t>
-      </w:r>
-    </w:p>
-    <w:p>
-      <w:pPr>
-        <w:pStyle w:val="ListeParagraf"/>
-        <w:spacing w:after="0" w:line="240" w:lineRule="auto"/>
-      </w:pPr>
-      <w:r>
-        <w:t xml:space="preserve">    IsBaslamaTarih DATE DEFAULT CURRENT_DATE</w:t>
-      </w:r>
-    </w:p>
-    <w:p>
-      <w:pPr>
-        <w:pStyle w:val="ListeParagraf"/>
-        <w:spacing w:after="0" w:line="240" w:lineRule="auto"/>
+        <w:ind w:left="720"/>
+        <w:rPr>
+          <w:i/>
+        </w:rPr>
+      </w:pPr>
+      <w:r>
+        <w:rPr>
+          <w:i/>
+        </w:rPr>
+        <w:t>-- Ödünç tablosunu oluşturuyor: Kitap ödünç alma işlemlerini tutar.</w:t>
+      </w:r>
+    </w:p>
+    <w:p>
+      <w:pPr>
+        <w:spacing w:after="0" w:line="240" w:lineRule="auto"/>
+        <w:ind w:left="720"/>
+        <w:rPr>
+          <w:b/>
+        </w:rPr>
+      </w:pPr>
+      <w:r>
+        <w:rPr>
+          <w:b/>
+        </w:rPr>
+        <w:t>CREATE TABLE Odunc (</w:t>
+      </w:r>
+    </w:p>
+    <w:p>
+      <w:pPr>
+        <w:spacing w:after="0" w:line="240" w:lineRule="auto"/>
+        <w:ind w:left="720"/>
+      </w:pPr>
+      <w:r>
+        <w:t>    OduncID SERIAL PRIMARY KEY,                </w:t>
+      </w:r>
+      <w:r>
+        <w:tab/>
+      </w:r>
+      <w:r>
+        <w:tab/>
+      </w:r>
+      <w:r>
+        <w:rPr>
+          <w:i/>
+        </w:rPr>
+        <w:t>-- Otomatik artan birincil anahtar</w:t>
+      </w:r>
+    </w:p>
+    <w:p>
+      <w:pPr>
+        <w:spacing w:after="0" w:line="240" w:lineRule="auto"/>
+        <w:ind w:left="720"/>
+      </w:pPr>
+      <w:r>
+        <w:t xml:space="preserve">    UyeID INT REFERENCES Uye(UyeID) ON DELETE CASCADE, </w:t>
+      </w:r>
+      <w:r>
+        <w:tab/>
+      </w:r>
+      <w:r>
+        <w:rPr>
+          <w:i/>
+        </w:rPr>
+        <w:t>-- Ödünç alan üye</w:t>
+      </w:r>
+    </w:p>
+    <w:p>
+      <w:pPr>
+        <w:spacing w:after="0" w:line="240" w:lineRule="auto"/>
+        <w:ind w:left="720"/>
+      </w:pPr>
+      <w:r>
+        <w:t xml:space="preserve">    KitapID INT REFERENCES Kitap(KitapID) ON DELETE CASCADE, </w:t>
+      </w:r>
+      <w:r>
+        <w:tab/>
+      </w:r>
+      <w:r>
+        <w:rPr>
+          <w:i/>
+        </w:rPr>
+        <w:t>-- Ödünç alınan kitap</w:t>
+      </w:r>
+    </w:p>
+    <w:p>
+      <w:pPr>
+        <w:spacing w:after="0" w:line="240" w:lineRule="auto"/>
+        <w:ind w:left="720"/>
+      </w:pPr>
+      <w:r>
+        <w:t>    OduncAlmaTarih DATE NOT NULL DEFAULT</w:t>
+      </w:r>
+      <w:r>
+        <w:t xml:space="preserve"> CURRENT_DATE,    </w:t>
+      </w:r>
+      <w:r>
+        <w:rPr>
+          <w:i/>
+        </w:rPr>
+        <w:t>-- Ödünç alma tarihi</w:t>
+      </w:r>
+    </w:p>
+    <w:p>
+      <w:pPr>
+        <w:spacing w:after="0" w:line="240" w:lineRule="auto"/>
+        <w:ind w:left="720"/>
+      </w:pPr>
+      <w:r>
+        <w:t xml:space="preserve">    GercekTeslimTarih DATE     </w:t>
+      </w:r>
+    </w:p>
+    <w:p>
+      <w:pPr>
+        <w:spacing w:after="0" w:line="240" w:lineRule="auto"/>
+        <w:ind w:left="720"/>
         <w:rPr>
           <w:b/>
         </w:rPr>
@@ -870,75 +1394,470 @@
     <w:p>
       <w:pPr>
         <w:spacing w:after="0" w:line="240" w:lineRule="auto"/>
-        <w:rPr>
-          <w:b/>
-        </w:rPr>
-      </w:pPr>
-    </w:p>
-    <w:p>
-      <w:pPr>
-        <w:pStyle w:val="ListeParagraf"/>
-        <w:spacing w:after="0" w:line="240" w:lineRule="auto"/>
-        <w:rPr>
-          <w:b/>
-        </w:rPr>
-      </w:pPr>
-      <w:r>
-        <w:rPr>
-          <w:b/>
-        </w:rPr>
-        <w:t>CREATE TABLE Odunc (</w:t>
-      </w:r>
-    </w:p>
-    <w:p>
-      <w:pPr>
-        <w:pStyle w:val="ListeParagraf"/>
-        <w:spacing w:after="0" w:line="240" w:lineRule="auto"/>
-      </w:pPr>
-      <w:r>
-        <w:t xml:space="preserve">    OduncID SERIAL PRIMARY KEY,</w:t>
-      </w:r>
-    </w:p>
-    <w:p>
-      <w:pPr>
-        <w:pStyle w:val="ListeParagraf"/>
-        <w:spacing w:after="0" w:line="240" w:lineRule="auto"/>
+        <w:ind w:left="720"/>
+        <w:rPr>
+          <w:i/>
+        </w:rPr>
+      </w:pPr>
+      <w:r>
+        <w:rPr>
+          <w:i/>
+        </w:rPr>
+        <w:t>-- Ceza tablosunu oluşturuyor: Ödünç alma işlemlerinden kaynaklanan cezaları tutar.</w:t>
+      </w:r>
+    </w:p>
+    <w:p>
+      <w:pPr>
+        <w:spacing w:after="0" w:line="240" w:lineRule="auto"/>
+        <w:ind w:left="720"/>
+        <w:rPr>
+          <w:b/>
+        </w:rPr>
+      </w:pPr>
+      <w:r>
+        <w:rPr>
+          <w:b/>
+        </w:rPr>
+        <w:t>CREATE TABLE Ceza (</w:t>
+      </w:r>
+    </w:p>
+    <w:p>
+      <w:pPr>
+        <w:spacing w:after="0" w:line="240" w:lineRule="auto"/>
+        <w:ind w:left="720"/>
+      </w:pPr>
+      <w:r>
+        <w:t xml:space="preserve">    CezaID SERIAL PRIMARY KEY,                </w:t>
+      </w:r>
+      <w:r>
+        <w:tab/>
+      </w:r>
+      <w:r>
+        <w:tab/>
+      </w:r>
+      <w:r>
+        <w:tab/>
+        <w:t xml:space="preserve">       </w:t>
+      </w:r>
+      <w:r>
+        <w:t xml:space="preserve"> </w:t>
+      </w:r>
+      <w:r>
+        <w:rPr>
+          <w:i/>
+        </w:rPr>
+        <w:t>-- Otomatik artan birincil anahtar</w:t>
+      </w:r>
+    </w:p>
+    <w:p>
+      <w:pPr>
+        <w:spacing w:after="0" w:line="240" w:lineRule="auto"/>
+        <w:ind w:left="720"/>
+      </w:pPr>
+      <w:r>
+        <w:t xml:space="preserve">    OduncID INT REFERENCES Odunc(OduncID) ON DELETE CASC</w:t>
+      </w:r>
+      <w:r>
+        <w:t xml:space="preserve">ADE, </w:t>
+      </w:r>
+      <w:r>
+        <w:rPr>
+          <w:i/>
+        </w:rPr>
+        <w:t xml:space="preserve">--Ceza ile ilişkili ödünç </w:t>
+      </w:r>
+      <w:r>
+        <w:rPr>
+          <w:i/>
+        </w:rPr>
+        <w:t>işlemi</w:t>
+      </w:r>
+    </w:p>
+    <w:p>
+      <w:pPr>
+        <w:spacing w:after="0" w:line="240" w:lineRule="auto"/>
+        <w:ind w:left="720"/>
+      </w:pPr>
+      <w:r>
+        <w:t xml:space="preserve">    UyeID INT REFERENCES Uye(UyeID) ON DELETE CASCADE,       </w:t>
+      </w:r>
+      <w:r>
+        <w:t xml:space="preserve">        </w:t>
+      </w:r>
+      <w:r>
+        <w:rPr>
+          <w:i/>
+        </w:rPr>
+        <w:t>-- Ceza alan üye</w:t>
+      </w:r>
+    </w:p>
+    <w:p>
+      <w:pPr>
+        <w:spacing w:after="0" w:line="240" w:lineRule="auto"/>
+        <w:ind w:left="720"/>
+      </w:pPr>
+      <w:r>
+        <w:t xml:space="preserve">    CezaMiktar DECIMAL(10, 2) NOT NULL,         </w:t>
+      </w:r>
+      <w:r>
+        <w:tab/>
+      </w:r>
+      <w:r>
+        <w:tab/>
+      </w:r>
+      <w:r>
+        <w:tab/>
+      </w:r>
+      <w:r>
+        <w:rPr>
+          <w:i/>
+        </w:rPr>
+        <w:t xml:space="preserve">      </w:t>
+      </w:r>
+      <w:r>
+        <w:rPr>
+          <w:i/>
+        </w:rPr>
+        <w:t>-- Ceza miktarı</w:t>
+      </w:r>
+      <w:r>
+        <w:t xml:space="preserve">    </w:t>
+      </w:r>
+      <w:r>
+        <w:t xml:space="preserve"> </w:t>
+      </w:r>
+      <w:r>
+        <w:t xml:space="preserve"> </w:t>
+      </w:r>
+    </w:p>
+    <w:p>
+      <w:pPr>
+        <w:spacing w:after="0" w:line="240" w:lineRule="auto"/>
+        <w:ind w:left="720"/>
+      </w:pPr>
+      <w:r>
+        <w:t xml:space="preserve">    </w:t>
+      </w:r>
+      <w:r>
+        <w:t xml:space="preserve">CezaTarih DATE NOT NULL DEFAULT CURRENT_DATE </w:t>
+      </w:r>
+      <w:r>
+        <w:tab/>
+      </w:r>
+      <w:r>
+        <w:tab/>
+        <w:t xml:space="preserve">      </w:t>
+      </w:r>
+      <w:r>
+        <w:rPr>
+          <w:i/>
+        </w:rPr>
+        <w:t>-- Ceza tarihi</w:t>
+      </w:r>
+    </w:p>
+    <w:p>
+      <w:pPr>
+        <w:spacing w:after="0" w:line="240" w:lineRule="auto"/>
+        <w:ind w:left="720"/>
+        <w:rPr>
+          <w:b/>
+        </w:rPr>
+      </w:pPr>
+      <w:r>
+        <w:rPr>
+          <w:b/>
+        </w:rPr>
+        <w:t>);</w:t>
+      </w:r>
+    </w:p>
+    <w:p>
+      <w:pPr>
+        <w:spacing w:after="0" w:line="240" w:lineRule="auto"/>
+        <w:ind w:left="720"/>
+        <w:rPr>
+          <w:i/>
+        </w:rPr>
+      </w:pPr>
+      <w:r>
+        <w:rPr>
+          <w:i/>
+        </w:rPr>
+        <w:t>-- Rezervasyon tablosunu oluşturuyor: Üyelerin kitap rezervasyonlarını tutar.</w:t>
+      </w:r>
+    </w:p>
+    <w:p>
+      <w:pPr>
+        <w:spacing w:after="0" w:line="240" w:lineRule="auto"/>
+        <w:ind w:left="720"/>
+        <w:rPr>
+          <w:b/>
+        </w:rPr>
+      </w:pPr>
+      <w:r>
+        <w:rPr>
+          <w:b/>
+        </w:rPr>
+        <w:t>CREATE TABLE Rezervasyon (</w:t>
+      </w:r>
+    </w:p>
+    <w:p>
+      <w:pPr>
+        <w:spacing w:after="0" w:line="240" w:lineRule="auto"/>
+        <w:ind w:left="720"/>
+      </w:pPr>
+      <w:r>
+        <w:t xml:space="preserve">    RezervasyonID SERIAL PRIMARY KEY,                   </w:t>
+      </w:r>
+      <w:r>
+        <w:tab/>
+      </w:r>
+      <w:r>
+        <w:rPr>
+          <w:i/>
+        </w:rPr>
+        <w:t>-- Otomatik artan birincil anahtar</w:t>
+      </w:r>
+    </w:p>
+    <w:p>
+      <w:pPr>
+        <w:spacing w:after="0" w:line="240" w:lineRule="auto"/>
+        <w:ind w:left="720"/>
+      </w:pPr>
+      <w:r>
+        <w:t xml:space="preserve">    UyeID INT REFERENCES Uye(UyeID) ON DELETE CASCADE,  </w:t>
+      </w:r>
+      <w:r>
+        <w:tab/>
+      </w:r>
+      <w:r>
+        <w:rPr>
+          <w:i/>
+        </w:rPr>
+        <w:t>-- Rezervasyonu yapan üye</w:t>
+      </w:r>
+    </w:p>
+    <w:p>
+      <w:pPr>
+        <w:spacing w:after="0" w:line="240" w:lineRule="auto"/>
+        <w:ind w:left="720"/>
+        <w:rPr>
+          <w:i/>
+        </w:rPr>
+      </w:pPr>
+      <w:r>
+        <w:t xml:space="preserve">    KitapID INT REFERENCES Kitap(KitapID) ON DELETE CASCADE,</w:t>
+      </w:r>
+      <w:r>
+        <w:tab/>
+      </w:r>
+      <w:r>
+        <w:t xml:space="preserve"> </w:t>
+      </w:r>
+      <w:r>
+        <w:rPr>
+          <w:i/>
+        </w:rPr>
+        <w:t>-- Rezerve edilen kitap</w:t>
+      </w:r>
+    </w:p>
+    <w:p>
+      <w:pPr>
+        <w:spacing w:after="0" w:line="240" w:lineRule="auto"/>
+        <w:ind w:left="720"/>
+      </w:pPr>
+      <w:r>
+        <w:t xml:space="preserve">    RezervasyonTarih DATE NOT NULL DEFAULT CURRENT_DATE,</w:t>
+      </w:r>
+      <w:r>
+        <w:tab/>
+      </w:r>
+      <w:r>
+        <w:t xml:space="preserve"> </w:t>
+      </w:r>
+      <w:r>
+        <w:rPr>
+          <w:i/>
+        </w:rPr>
+        <w:t>-- Rezervasyon tarihi</w:t>
+      </w:r>
+    </w:p>
+    <w:p>
+      <w:pPr>
+        <w:spacing w:after="0" w:line="240" w:lineRule="auto"/>
+        <w:ind w:left="720"/>
+      </w:pPr>
+      <w:r>
+        <w:t xml:space="preserve">    Durum VARCHAR(50) DEFAULT 'Boşta',                  </w:t>
+      </w:r>
+      <w:r>
+        <w:tab/>
+      </w:r>
+      <w:r>
+        <w:tab/>
+      </w:r>
+      <w:r>
+        <w:rPr>
+          <w:i/>
+        </w:rPr>
+        <w:t>-- Rezervasyon durumu</w:t>
+      </w:r>
+    </w:p>
+    <w:p>
+      <w:pPr>
+        <w:spacing w:after="0" w:line="240" w:lineRule="auto"/>
+        <w:ind w:left="720"/>
+      </w:pPr>
+      <w:r>
+        <w:t xml:space="preserve">    UNIQUE (KitapID, Durum)                           </w:t>
+      </w:r>
+      <w:r>
+        <w:tab/>
+      </w:r>
+      <w:r>
+        <w:t xml:space="preserve">  </w:t>
+      </w:r>
+      <w:r>
+        <w:rPr>
+          <w:i/>
+        </w:rPr>
+        <w:t>-- Kitap için yalnızca bir aktif rezervasyon</w:t>
+      </w:r>
+    </w:p>
+    <w:p>
+      <w:pPr>
+        <w:spacing w:after="0" w:line="240" w:lineRule="auto"/>
+        <w:ind w:left="720"/>
+        <w:rPr>
+          <w:b/>
+        </w:rPr>
+      </w:pPr>
+      <w:r>
+        <w:rPr>
+          <w:b/>
+        </w:rPr>
+        <w:t>);</w:t>
+      </w:r>
+    </w:p>
+    <w:p>
+      <w:pPr>
+        <w:spacing w:after="0" w:line="240" w:lineRule="auto"/>
+        <w:ind w:left="720"/>
+        <w:rPr>
+          <w:i/>
+        </w:rPr>
+      </w:pPr>
+      <w:r>
+        <w:rPr>
+          <w:i/>
+        </w:rPr>
+        <w:t>-- Bağış tablosunu oluşturuyor: Üyelerin kitap bağışlarını tutar.</w:t>
+      </w:r>
+    </w:p>
+    <w:p>
+      <w:pPr>
+        <w:spacing w:after="0" w:line="240" w:lineRule="auto"/>
+        <w:ind w:left="720"/>
+        <w:rPr>
+          <w:b/>
+        </w:rPr>
+      </w:pPr>
+      <w:r>
+        <w:rPr>
+          <w:b/>
+        </w:rPr>
+        <w:t>CREATE TABLE Bagis (</w:t>
+      </w:r>
+    </w:p>
+    <w:p>
+      <w:pPr>
+        <w:spacing w:after="0" w:line="240" w:lineRule="auto"/>
+        <w:ind w:left="720"/>
+      </w:pPr>
+      <w:r>
+        <w:t xml:space="preserve">    BagisID SERIAL PRIMARY KEY,              </w:t>
+      </w:r>
+      <w:r>
+        <w:tab/>
+      </w:r>
+      <w:r>
+        <w:tab/>
+      </w:r>
+      <w:r>
+        <w:tab/>
+        <w:t xml:space="preserve"> </w:t>
+      </w:r>
+      <w:r>
+        <w:rPr>
+          <w:i/>
+        </w:rPr>
+        <w:t>-- Otomatik artan birincil anahtar</w:t>
+      </w:r>
+    </w:p>
+    <w:p>
+      <w:pPr>
+        <w:spacing w:after="0" w:line="240" w:lineRule="auto"/>
+        <w:ind w:left="720"/>
       </w:pPr>
       <w:r>
         <w:t xml:space="preserve">    UyeID INT REFERENCES Uye(UyeID) ON DELETE CASCADE,</w:t>
       </w:r>
-    </w:p>
-    <w:p>
-      <w:pPr>
-        <w:pStyle w:val="ListeParagraf"/>
-        <w:spacing w:after="0" w:line="240" w:lineRule="auto"/>
+      <w:r>
+        <w:tab/>
+      </w:r>
+      <w:r>
+        <w:rPr>
+          <w:i/>
+        </w:rPr>
+        <w:t xml:space="preserve"> -- Bağış yapan üye</w:t>
+      </w:r>
+    </w:p>
+    <w:p>
+      <w:pPr>
+        <w:spacing w:after="0" w:line="240" w:lineRule="auto"/>
+        <w:ind w:left="720"/>
       </w:pPr>
       <w:r>
         <w:t xml:space="preserve">    KitapID INT REFERENCES Kitap(KitapID) ON DELETE CASCADE,</w:t>
       </w:r>
-    </w:p>
-    <w:p>
-      <w:pPr>
-        <w:pStyle w:val="ListeParagraf"/>
-        <w:spacing w:after="0" w:line="240" w:lineRule="auto"/>
-      </w:pPr>
-      <w:r>
-        <w:t xml:space="preserve">    OduncAlmaTarih DATE NOT NULL DEFAULT CURRENT_DATE,</w:t>
-      </w:r>
-    </w:p>
-    <w:p>
-      <w:pPr>
-        <w:pStyle w:val="ListeParagraf"/>
-        <w:spacing w:after="0" w:line="240" w:lineRule="auto"/>
-      </w:pPr>
-      <w:r>
-        <w:t xml:space="preserve">    GercekTeslimTarih DATE</w:t>
-      </w:r>
-    </w:p>
-    <w:p>
-      <w:pPr>
-        <w:pStyle w:val="ListeParagraf"/>
-        <w:spacing w:after="0" w:line="240" w:lineRule="auto"/>
+      <w:r>
+        <w:tab/>
+      </w:r>
+      <w:r>
+        <w:t xml:space="preserve"> </w:t>
+      </w:r>
+      <w:r>
+        <w:rPr>
+          <w:i/>
+        </w:rPr>
+        <w:t>-- Bağışlanan kitap</w:t>
+      </w:r>
+    </w:p>
+    <w:p>
+      <w:pPr>
+        <w:spacing w:after="0" w:line="240" w:lineRule="auto"/>
+        <w:ind w:left="720"/>
+      </w:pPr>
+      <w:r>
+        <w:t xml:space="preserve">    BagisTarih DATE NOT NULL DEFAULT CURRENT_DATE </w:t>
+      </w:r>
+      <w:r>
+        <w:tab/>
+      </w:r>
+      <w:r>
+        <w:tab/>
+        <w:t xml:space="preserve"> </w:t>
+      </w:r>
+      <w:r>
+        <w:rPr>
+          <w:i/>
+        </w:rPr>
+        <w:t>-- Bağış tarihi</w:t>
+      </w:r>
+    </w:p>
+    <w:p>
+      <w:pPr>
+        <w:spacing w:after="0" w:line="240" w:lineRule="auto"/>
+        <w:ind w:left="720"/>
         <w:rPr>
           <w:b/>
         </w:rPr>
@@ -960,215 +1879,66 @@
     </w:p>
     <w:p>
       <w:pPr>
-        <w:pStyle w:val="ListeParagraf"/>
-        <w:spacing w:after="0" w:line="240" w:lineRule="auto"/>
-        <w:rPr>
-          <w:b/>
-        </w:rPr>
-      </w:pPr>
-      <w:r>
-        <w:rPr>
-          <w:b/>
-        </w:rPr>
-        <w:t>CREATE TABLE Ceza (</w:t>
-      </w:r>
-    </w:p>
-    <w:p>
-      <w:pPr>
-        <w:pStyle w:val="ListeParagraf"/>
-        <w:spacing w:after="0" w:line="240" w:lineRule="auto"/>
-      </w:pPr>
-      <w:r>
-        <w:t xml:space="preserve">    CezaID SERIAL PRIMARY KEY,</w:t>
-      </w:r>
-    </w:p>
-    <w:p>
-      <w:pPr>
-        <w:pStyle w:val="ListeParagraf"/>
-        <w:spacing w:after="0" w:line="240" w:lineRule="auto"/>
-      </w:pPr>
-      <w:r>
-        <w:t xml:space="preserve">    OduncID INT REFERENCES Odunc(OduncID) ON DELETE CASCADE,</w:t>
-      </w:r>
-    </w:p>
-    <w:p>
-      <w:pPr>
-        <w:pStyle w:val="ListeParagraf"/>
-        <w:spacing w:after="0" w:line="240" w:lineRule="auto"/>
-      </w:pPr>
-      <w:r>
-        <w:t xml:space="preserve">    CezaMiktar DECIMAL(10, 2) NOT NULL,</w:t>
-      </w:r>
-    </w:p>
-    <w:p>
-      <w:pPr>
-        <w:pStyle w:val="ListeParagraf"/>
-        <w:spacing w:after="0" w:line="240" w:lineRule="auto"/>
-      </w:pPr>
-      <w:r>
-        <w:t xml:space="preserve">    CezaTarih DATE NOT NULL DEFAULT CURRENT_DATE</w:t>
-      </w:r>
-    </w:p>
-    <w:p>
-      <w:pPr>
-        <w:pStyle w:val="ListeParagraf"/>
-        <w:spacing w:after="0" w:line="240" w:lineRule="auto"/>
-        <w:rPr>
-          <w:b/>
-        </w:rPr>
-      </w:pPr>
-      <w:r>
-        <w:rPr>
-          <w:b/>
-        </w:rPr>
-        <w:t>);</w:t>
-      </w:r>
-    </w:p>
-    <w:p>
-      <w:pPr>
-        <w:spacing w:after="0" w:line="240" w:lineRule="auto"/>
-        <w:rPr>
-          <w:b/>
-        </w:rPr>
-      </w:pPr>
-    </w:p>
-    <w:p>
-      <w:pPr>
-        <w:pStyle w:val="ListeParagraf"/>
-        <w:spacing w:after="0" w:line="240" w:lineRule="auto"/>
-        <w:rPr>
-          <w:b/>
-        </w:rPr>
-      </w:pPr>
-      <w:r>
-        <w:rPr>
-          <w:b/>
-        </w:rPr>
-        <w:t>CREATE TABLE Rezervasyon (</w:t>
-      </w:r>
-    </w:p>
-    <w:p>
-      <w:pPr>
-        <w:pStyle w:val="ListeParagraf"/>
-        <w:spacing w:after="0" w:line="240" w:lineRule="auto"/>
-      </w:pPr>
-      <w:r>
-        <w:t xml:space="preserve">    RezervasyonID SERIAL PRIMARY KEY,</w:t>
-      </w:r>
-    </w:p>
-    <w:p>
-      <w:pPr>
-        <w:pStyle w:val="ListeParagraf"/>
-        <w:spacing w:after="0" w:line="240" w:lineRule="auto"/>
-      </w:pPr>
-      <w:r>
-        <w:t xml:space="preserve">    UyeID INT REFERENCES Uye(UyeID) ON DELETE CASCADE,</w:t>
-      </w:r>
-    </w:p>
-    <w:p>
-      <w:pPr>
-        <w:pStyle w:val="ListeParagraf"/>
-        <w:spacing w:after="0" w:line="240" w:lineRule="auto"/>
-      </w:pPr>
-      <w:r>
-        <w:t xml:space="preserve">    KitapID INT REFERENCES Kitap(KitapID) ON DELETE CASCADE,</w:t>
-      </w:r>
-    </w:p>
-    <w:p>
-      <w:pPr>
-        <w:pStyle w:val="ListeParagraf"/>
-        <w:spacing w:after="0" w:line="240" w:lineRule="auto"/>
-      </w:pPr>
-      <w:r>
-        <w:t xml:space="preserve">    RezervasyonTarih DATE NOT NULL DEFAULT CURRENT_DATE</w:t>
-      </w:r>
-    </w:p>
-    <w:p>
-      <w:pPr>
-        <w:pStyle w:val="ListeParagraf"/>
-        <w:spacing w:after="0" w:line="240" w:lineRule="auto"/>
-        <w:rPr>
-          <w:b/>
-        </w:rPr>
-      </w:pPr>
-      <w:r>
-        <w:rPr>
-          <w:b/>
-        </w:rPr>
-        <w:t>);</w:t>
-      </w:r>
-    </w:p>
-    <w:p>
-      <w:pPr>
-        <w:spacing w:after="0" w:line="240" w:lineRule="auto"/>
-        <w:rPr>
-          <w:b/>
-        </w:rPr>
-      </w:pPr>
-    </w:p>
-    <w:p>
-      <w:pPr>
-        <w:pStyle w:val="ListeParagraf"/>
-        <w:spacing w:after="0" w:line="240" w:lineRule="auto"/>
-        <w:rPr>
-          <w:b/>
-        </w:rPr>
-      </w:pPr>
-      <w:r>
-        <w:rPr>
-          <w:b/>
-        </w:rPr>
-        <w:t>CREATE TABLE Bagis (</w:t>
-      </w:r>
-    </w:p>
-    <w:p>
-      <w:pPr>
-        <w:pStyle w:val="ListeParagraf"/>
-        <w:spacing w:after="0" w:line="240" w:lineRule="auto"/>
-      </w:pPr>
-      <w:r>
-        <w:t xml:space="preserve">    BagisID SERIAL PRIMARY KEY,</w:t>
-      </w:r>
-    </w:p>
-    <w:p>
-      <w:pPr>
-        <w:pStyle w:val="ListeParagraf"/>
-        <w:spacing w:after="0" w:line="240" w:lineRule="auto"/>
-      </w:pPr>
-      <w:r>
-        <w:t xml:space="preserve">    KitapID INT REFERENCES Kitap(KitapID) ON DELETE CASCADE,</w:t>
-      </w:r>
-    </w:p>
-    <w:p>
-      <w:pPr>
-        <w:pStyle w:val="ListeParagraf"/>
-        <w:spacing w:after="0" w:line="240" w:lineRule="auto"/>
-      </w:pPr>
-      <w:r>
-        <w:t xml:space="preserve">    BagisTarih DATE NOT NULL DEFAULT CURRENT_DATE</w:t>
-      </w:r>
-    </w:p>
-    <w:p>
-      <w:pPr>
-        <w:pStyle w:val="ListeParagraf"/>
-        <w:spacing w:after="0" w:line="240" w:lineRule="auto"/>
-        <w:rPr>
-          <w:b/>
-        </w:rPr>
-      </w:pPr>
-      <w:r>
-        <w:rPr>
-          <w:b/>
-        </w:rPr>
-        <w:t>);</w:t>
-      </w:r>
+        <w:spacing w:after="0" w:line="240" w:lineRule="auto"/>
+        <w:rPr>
+          <w:b/>
+        </w:rPr>
+      </w:pPr>
+    </w:p>
+    <w:p>
+      <w:pPr>
+        <w:spacing w:after="0" w:line="240" w:lineRule="auto"/>
+        <w:rPr>
+          <w:b/>
+        </w:rPr>
+      </w:pPr>
+    </w:p>
+    <w:p>
+      <w:pPr>
+        <w:spacing w:after="0" w:line="240" w:lineRule="auto"/>
+        <w:rPr>
+          <w:b/>
+        </w:rPr>
+      </w:pPr>
+    </w:p>
+    <w:p>
+      <w:pPr>
+        <w:spacing w:after="0" w:line="240" w:lineRule="auto"/>
+        <w:rPr>
+          <w:b/>
+        </w:rPr>
+      </w:pPr>
+    </w:p>
+    <w:p>
+      <w:pPr>
+        <w:spacing w:after="0" w:line="240" w:lineRule="auto"/>
+        <w:rPr>
+          <w:b/>
+        </w:rPr>
+      </w:pPr>
+    </w:p>
+    <w:p>
+      <w:pPr>
+        <w:spacing w:after="0" w:line="240" w:lineRule="auto"/>
+        <w:rPr>
+          <w:b/>
+        </w:rPr>
+      </w:pPr>
+    </w:p>
+    <w:p>
+      <w:pPr>
+        <w:spacing w:after="0" w:line="240" w:lineRule="auto"/>
+        <w:rPr>
+          <w:b/>
+        </w:rPr>
+      </w:pPr>
     </w:p>
     <w:p>
       <w:pPr>
         <w:pStyle w:val="ListeParagraf"/>
         <w:numPr>
           <w:ilvl w:val="0"/>
-          <w:numId w:val="35"/>
+          <w:numId w:val="37"/>
         </w:numPr>
         <w:spacing w:after="0" w:line="240" w:lineRule="auto"/>
         <w:rPr>
@@ -1179,19 +1949,163 @@
         <w:rPr>
           <w:b/>
         </w:rPr>
-        <w:t>Tablolara Verilerin Eklenmes</w:t>
-      </w:r>
-      <w:r>
-        <w:rPr>
-          <w:b/>
-        </w:rPr>
-        <w:t>i</w:t>
-      </w:r>
-    </w:p>
-    <w:p>
-      <w:pPr>
-        <w:spacing w:after="0" w:line="240" w:lineRule="auto"/>
-        <w:ind w:left="1080"/>
+        <w:t>Tablolara Verilerin Eklenmesi</w:t>
+      </w:r>
+    </w:p>
+    <w:p>
+      <w:pPr>
+        <w:pStyle w:val="ListeParagraf"/>
+        <w:spacing w:after="0" w:line="240" w:lineRule="auto"/>
+        <w:rPr>
+          <w:b/>
+        </w:rPr>
+      </w:pPr>
+    </w:p>
+    <w:p>
+      <w:pPr>
+        <w:pStyle w:val="ListeParagraf"/>
+        <w:spacing w:after="0" w:line="240" w:lineRule="auto"/>
+        <w:rPr>
+          <w:b/>
+        </w:rPr>
+      </w:pPr>
+      <w:r>
+        <w:rPr>
+          <w:b/>
+        </w:rPr>
+        <w:t>INSERT INTO Raf (RafNo, Bolum) VALUES</w:t>
+      </w:r>
+    </w:p>
+    <w:p>
+      <w:pPr>
+        <w:pStyle w:val="ListeParagraf"/>
+        <w:spacing w:after="0" w:line="240" w:lineRule="auto"/>
+      </w:pPr>
+      <w:r>
+        <w:t>('R1', 'Roman Bölümü'),</w:t>
+      </w:r>
+    </w:p>
+    <w:p>
+      <w:pPr>
+        <w:pStyle w:val="ListeParagraf"/>
+        <w:spacing w:after="0" w:line="240" w:lineRule="auto"/>
+      </w:pPr>
+      <w:r>
+        <w:t>('R2', 'Fantastik Bölümü'),</w:t>
+      </w:r>
+    </w:p>
+    <w:p>
+      <w:pPr>
+        <w:pStyle w:val="ListeParagraf"/>
+        <w:spacing w:after="0" w:line="240" w:lineRule="auto"/>
+      </w:pPr>
+      <w:r>
+        <w:t>('R3', 'Bilim Kurgu Bölümü'),</w:t>
+      </w:r>
+    </w:p>
+    <w:p>
+      <w:pPr>
+        <w:pStyle w:val="ListeParagraf"/>
+        <w:spacing w:after="0" w:line="240" w:lineRule="auto"/>
+      </w:pPr>
+      <w:r>
+        <w:t>('R4', 'Tarih Bölümü'),</w:t>
+      </w:r>
+    </w:p>
+    <w:p>
+      <w:pPr>
+        <w:pStyle w:val="ListeParagraf"/>
+        <w:spacing w:after="0" w:line="240" w:lineRule="auto"/>
+      </w:pPr>
+      <w:r>
+        <w:t>('R5', 'Sanat Bölümü'),</w:t>
+      </w:r>
+    </w:p>
+    <w:p>
+      <w:pPr>
+        <w:pStyle w:val="ListeParagraf"/>
+        <w:spacing w:after="0" w:line="240" w:lineRule="auto"/>
+      </w:pPr>
+      <w:r>
+        <w:t>('R6', 'Teknoloji Bölümü'),</w:t>
+      </w:r>
+    </w:p>
+    <w:p>
+      <w:pPr>
+        <w:pStyle w:val="ListeParagraf"/>
+        <w:spacing w:after="0" w:line="240" w:lineRule="auto"/>
+      </w:pPr>
+      <w:r>
+        <w:t>('R7', 'Çocuk Kitapları Bölümü'),</w:t>
+      </w:r>
+    </w:p>
+    <w:p>
+      <w:pPr>
+        <w:pStyle w:val="ListeParagraf"/>
+        <w:spacing w:after="0" w:line="240" w:lineRule="auto"/>
+      </w:pPr>
+      <w:r>
+        <w:t>('R8', 'Edebiyat Bölümü'),</w:t>
+      </w:r>
+    </w:p>
+    <w:p>
+      <w:pPr>
+        <w:pStyle w:val="ListeParagraf"/>
+        <w:spacing w:after="0" w:line="240" w:lineRule="auto"/>
+      </w:pPr>
+      <w:r>
+        <w:t>('R9', 'Felsefe Bölümü'),</w:t>
+      </w:r>
+    </w:p>
+    <w:p>
+      <w:pPr>
+        <w:pStyle w:val="ListeParagraf"/>
+        <w:spacing w:after="0" w:line="240" w:lineRule="auto"/>
+      </w:pPr>
+      <w:r>
+        <w:t>('R10', 'Psikoloji Bölümü');</w:t>
+      </w:r>
+    </w:p>
+    <w:p>
+      <w:pPr>
+        <w:pStyle w:val="ListeParagraf"/>
+        <w:spacing w:after="0" w:line="240" w:lineRule="auto"/>
+        <w:rPr>
+          <w:b/>
+        </w:rPr>
+      </w:pPr>
+    </w:p>
+    <w:p>
+      <w:pPr>
+        <w:pStyle w:val="ListeParagraf"/>
+        <w:spacing w:after="0" w:line="240" w:lineRule="auto"/>
+        <w:rPr>
+          <w:b/>
+        </w:rPr>
+      </w:pPr>
+    </w:p>
+    <w:p>
+      <w:pPr>
+        <w:pStyle w:val="ListeParagraf"/>
+        <w:spacing w:after="0" w:line="240" w:lineRule="auto"/>
+        <w:rPr>
+          <w:b/>
+        </w:rPr>
+      </w:pPr>
+    </w:p>
+    <w:p>
+      <w:pPr>
+        <w:pStyle w:val="ListeParagraf"/>
+        <w:spacing w:after="0" w:line="240" w:lineRule="auto"/>
+        <w:rPr>
+          <w:b/>
+        </w:rPr>
+      </w:pPr>
+    </w:p>
+    <w:p>
+      <w:pPr>
+        <w:pStyle w:val="ListeParagraf"/>
+        <w:spacing w:after="0" w:line="240" w:lineRule="auto"/>
         <w:rPr>
           <w:b/>
         </w:rPr>
@@ -1205,8 +2119,8 @@
     </w:p>
     <w:p>
       <w:pPr>
-        <w:spacing w:after="0" w:line="240" w:lineRule="auto"/>
-        <w:ind w:left="1080"/>
+        <w:pStyle w:val="ListeParagraf"/>
+        <w:spacing w:after="0" w:line="240" w:lineRule="auto"/>
       </w:pPr>
       <w:r>
         <w:t>('Roman'),</w:t>
@@ -1214,8 +2128,8 @@
     </w:p>
     <w:p>
       <w:pPr>
-        <w:spacing w:after="0" w:line="240" w:lineRule="auto"/>
-        <w:ind w:left="1080"/>
+        <w:pStyle w:val="ListeParagraf"/>
+        <w:spacing w:after="0" w:line="240" w:lineRule="auto"/>
       </w:pPr>
       <w:r>
         <w:t>('Bilim'),</w:t>
@@ -1223,8 +2137,8 @@
     </w:p>
     <w:p>
       <w:pPr>
-        <w:spacing w:after="0" w:line="240" w:lineRule="auto"/>
-        <w:ind w:left="1080"/>
+        <w:pStyle w:val="ListeParagraf"/>
+        <w:spacing w:after="0" w:line="240" w:lineRule="auto"/>
       </w:pPr>
       <w:r>
         <w:t>('Sanat'),</w:t>
@@ -1232,8 +2146,8 @@
     </w:p>
     <w:p>
       <w:pPr>
-        <w:spacing w:after="0" w:line="240" w:lineRule="auto"/>
-        <w:ind w:left="1080"/>
+        <w:pStyle w:val="ListeParagraf"/>
+        <w:spacing w:after="0" w:line="240" w:lineRule="auto"/>
       </w:pPr>
       <w:r>
         <w:t>('Tarih'),</w:t>
@@ -1241,8 +2155,8 @@
     </w:p>
     <w:p>
       <w:pPr>
-        <w:spacing w:after="0" w:line="240" w:lineRule="auto"/>
-        <w:ind w:left="1080"/>
+        <w:pStyle w:val="ListeParagraf"/>
+        <w:spacing w:after="0" w:line="240" w:lineRule="auto"/>
       </w:pPr>
       <w:r>
         <w:t>('Felsefe'),</w:t>
@@ -1250,8 +2164,8 @@
     </w:p>
     <w:p>
       <w:pPr>
-        <w:spacing w:after="0" w:line="240" w:lineRule="auto"/>
-        <w:ind w:left="1080"/>
+        <w:pStyle w:val="ListeParagraf"/>
+        <w:spacing w:after="0" w:line="240" w:lineRule="auto"/>
       </w:pPr>
       <w:r>
         <w:t>('Teknoloji'),</w:t>
@@ -1259,8 +2173,8 @@
     </w:p>
     <w:p>
       <w:pPr>
-        <w:spacing w:after="0" w:line="240" w:lineRule="auto"/>
-        <w:ind w:left="1080"/>
+        <w:pStyle w:val="ListeParagraf"/>
+        <w:spacing w:after="0" w:line="240" w:lineRule="auto"/>
       </w:pPr>
       <w:r>
         <w:t>('Psikoloji'),</w:t>
@@ -1268,8 +2182,8 @@
     </w:p>
     <w:p>
       <w:pPr>
-        <w:spacing w:after="0" w:line="240" w:lineRule="auto"/>
-        <w:ind w:left="1080"/>
+        <w:pStyle w:val="ListeParagraf"/>
+        <w:spacing w:after="0" w:line="240" w:lineRule="auto"/>
       </w:pPr>
       <w:r>
         <w:t>('Edebiyat'),</w:t>
@@ -1277,8 +2191,8 @@
     </w:p>
     <w:p>
       <w:pPr>
-        <w:spacing w:after="0" w:line="240" w:lineRule="auto"/>
-        <w:ind w:left="1080"/>
+        <w:pStyle w:val="ListeParagraf"/>
+        <w:spacing w:after="0" w:line="240" w:lineRule="auto"/>
       </w:pPr>
       <w:r>
         <w:t>('Çocuk'),</w:t>
@@ -1286,8 +2200,8 @@
     </w:p>
     <w:p>
       <w:pPr>
-        <w:spacing w:after="0" w:line="240" w:lineRule="auto"/>
-        <w:ind w:left="1080"/>
+        <w:pStyle w:val="ListeParagraf"/>
+        <w:spacing w:after="0" w:line="240" w:lineRule="auto"/>
       </w:pPr>
       <w:r>
         <w:t>('Fantastik');</w:t>
@@ -1296,10 +2210,624 @@
     <w:p>
       <w:pPr>
         <w:pStyle w:val="ListeParagraf"/>
-        <w:numPr>
-          <w:ilvl w:val="0"/>
-          <w:numId w:val="35"/>
-        </w:numPr>
+        <w:spacing w:after="0" w:line="240" w:lineRule="auto"/>
+        <w:rPr>
+          <w:b/>
+        </w:rPr>
+      </w:pPr>
+    </w:p>
+    <w:p>
+      <w:pPr>
+        <w:pStyle w:val="ListeParagraf"/>
+        <w:spacing w:after="0" w:line="240" w:lineRule="auto"/>
+        <w:rPr>
+          <w:b/>
+        </w:rPr>
+      </w:pPr>
+    </w:p>
+    <w:p>
+      <w:pPr>
+        <w:pStyle w:val="ListeParagraf"/>
+        <w:spacing w:after="0" w:line="240" w:lineRule="auto"/>
+        <w:rPr>
+          <w:b/>
+        </w:rPr>
+      </w:pPr>
+    </w:p>
+    <w:p>
+      <w:pPr>
+        <w:pStyle w:val="ListeParagraf"/>
+        <w:spacing w:after="0" w:line="240" w:lineRule="auto"/>
+        <w:rPr>
+          <w:b/>
+        </w:rPr>
+      </w:pPr>
+    </w:p>
+    <w:p>
+      <w:pPr>
+        <w:pStyle w:val="ListeParagraf"/>
+        <w:spacing w:after="0" w:line="240" w:lineRule="auto"/>
+        <w:rPr>
+          <w:b/>
+        </w:rPr>
+      </w:pPr>
+      <w:r>
+        <w:rPr>
+          <w:b/>
+        </w:rPr>
+        <w:t>INSERT INTO Yazar (YazarAdi, YazarSoyad) VALUES</w:t>
+      </w:r>
+    </w:p>
+    <w:p>
+      <w:pPr>
+        <w:pStyle w:val="ListeParagraf"/>
+        <w:spacing w:after="0" w:line="240" w:lineRule="auto"/>
+      </w:pPr>
+      <w:r>
+        <w:t>('Orhan', 'Pamuk'),</w:t>
+      </w:r>
+    </w:p>
+    <w:p>
+      <w:pPr>
+        <w:pStyle w:val="ListeParagraf"/>
+        <w:spacing w:after="0" w:line="240" w:lineRule="auto"/>
+      </w:pPr>
+      <w:r>
+        <w:t>('Elif', 'Şafak'),</w:t>
+      </w:r>
+    </w:p>
+    <w:p>
+      <w:pPr>
+        <w:pStyle w:val="ListeParagraf"/>
+        <w:spacing w:after="0" w:line="240" w:lineRule="auto"/>
+      </w:pPr>
+      <w:r>
+        <w:t>('J.K.', 'Rowling'),</w:t>
+      </w:r>
+    </w:p>
+    <w:p>
+      <w:pPr>
+        <w:pStyle w:val="ListeParagraf"/>
+        <w:spacing w:after="0" w:line="240" w:lineRule="auto"/>
+      </w:pPr>
+      <w:r>
+        <w:t>('Fyodor', 'Dostoyevski'),</w:t>
+      </w:r>
+    </w:p>
+    <w:p>
+      <w:pPr>
+        <w:pStyle w:val="ListeParagraf"/>
+        <w:spacing w:after="0" w:line="240" w:lineRule="auto"/>
+      </w:pPr>
+      <w:r>
+        <w:t>('Albert', 'Camus'),</w:t>
+      </w:r>
+    </w:p>
+    <w:p>
+      <w:pPr>
+        <w:pStyle w:val="ListeParagraf"/>
+        <w:spacing w:after="0" w:line="240" w:lineRule="auto"/>
+      </w:pPr>
+      <w:r>
+        <w:t>('Yuval Noah', 'Harari'),</w:t>
+      </w:r>
+    </w:p>
+    <w:p>
+      <w:pPr>
+        <w:pStyle w:val="ListeParagraf"/>
+        <w:spacing w:after="0" w:line="240" w:lineRule="auto"/>
+      </w:pPr>
+      <w:r>
+        <w:t>('George', 'Orwell'),</w:t>
+      </w:r>
+    </w:p>
+    <w:p>
+      <w:pPr>
+        <w:pStyle w:val="ListeParagraf"/>
+        <w:spacing w:after="0" w:line="240" w:lineRule="auto"/>
+      </w:pPr>
+      <w:r>
+        <w:t>('Virginia', 'Woolf'),</w:t>
+      </w:r>
+    </w:p>
+    <w:p>
+      <w:pPr>
+        <w:pStyle w:val="ListeParagraf"/>
+        <w:spacing w:after="0" w:line="240" w:lineRule="auto"/>
+      </w:pPr>
+      <w:r>
+        <w:t>('Stefan', 'Zweig'),</w:t>
+      </w:r>
+    </w:p>
+    <w:p>
+      <w:pPr>
+        <w:pStyle w:val="ListeParagraf"/>
+        <w:spacing w:after="0" w:line="240" w:lineRule="auto"/>
+      </w:pPr>
+      <w:r>
+        <w:t>('J.R.R.', 'Tolkien');</w:t>
+      </w:r>
+    </w:p>
+    <w:p>
+      <w:pPr>
+        <w:pStyle w:val="ListeParagraf"/>
+        <w:spacing w:after="0" w:line="240" w:lineRule="auto"/>
+        <w:rPr>
+          <w:b/>
+        </w:rPr>
+      </w:pPr>
+    </w:p>
+    <w:p>
+      <w:pPr>
+        <w:pStyle w:val="ListeParagraf"/>
+        <w:spacing w:after="0" w:line="240" w:lineRule="auto"/>
+        <w:rPr>
+          <w:b/>
+        </w:rPr>
+      </w:pPr>
+    </w:p>
+    <w:p>
+      <w:pPr>
+        <w:pStyle w:val="ListeParagraf"/>
+        <w:spacing w:after="0" w:line="240" w:lineRule="auto"/>
+        <w:rPr>
+          <w:b/>
+        </w:rPr>
+      </w:pPr>
+    </w:p>
+    <w:p>
+      <w:pPr>
+        <w:pStyle w:val="ListeParagraf"/>
+        <w:spacing w:after="0" w:line="240" w:lineRule="auto"/>
+        <w:rPr>
+          <w:b/>
+        </w:rPr>
+      </w:pPr>
+    </w:p>
+    <w:p>
+      <w:pPr>
+        <w:pStyle w:val="ListeParagraf"/>
+        <w:spacing w:after="0" w:line="240" w:lineRule="auto"/>
+        <w:rPr>
+          <w:b/>
+        </w:rPr>
+      </w:pPr>
+    </w:p>
+    <w:p>
+      <w:pPr>
+        <w:pStyle w:val="ListeParagraf"/>
+        <w:spacing w:after="0" w:line="240" w:lineRule="auto"/>
+        <w:rPr>
+          <w:b/>
+        </w:rPr>
+      </w:pPr>
+    </w:p>
+    <w:p>
+      <w:pPr>
+        <w:pStyle w:val="ListeParagraf"/>
+        <w:spacing w:after="0" w:line="240" w:lineRule="auto"/>
+        <w:rPr>
+          <w:b/>
+        </w:rPr>
+      </w:pPr>
+      <w:r>
+        <w:rPr>
+          <w:b/>
+        </w:rPr>
+        <w:t>INSERT INTO Kitap (KitapAdi, ISBN, BasimYili, Yayinevi, Adet, KategoriID, YazarID, RafNo) VALUES</w:t>
+      </w:r>
+    </w:p>
+    <w:p>
+      <w:pPr>
+        <w:pStyle w:val="ListeParagraf"/>
+        <w:spacing w:after="0" w:line="240" w:lineRule="auto"/>
+      </w:pPr>
+      <w:r>
+        <w:t>('Kar', '9789750800000', '2002-01-01', 'YKY', 5, 1, 1, 'R1'),</w:t>
+      </w:r>
+    </w:p>
+    <w:p>
+      <w:pPr>
+        <w:pStyle w:val="ListeParagraf"/>
+        <w:spacing w:after="0" w:line="240" w:lineRule="auto"/>
+      </w:pPr>
+      <w:r>
+        <w:t>('Harry Potter ve Felsefe Taşı', '9780545582889', '1997-06-26', 'Scholastic', 10, 10, 3, 'R2'),</w:t>
+      </w:r>
+    </w:p>
+    <w:p>
+      <w:pPr>
+        <w:pStyle w:val="ListeParagraf"/>
+        <w:spacing w:after="0" w:line="240" w:lineRule="auto"/>
+      </w:pPr>
+      <w:r>
+        <w:t>('1984', '9780141036144', '1949-06-08', 'Penguin', 7, 7, 7, 'R3'),</w:t>
+      </w:r>
+    </w:p>
+    <w:p>
+      <w:pPr>
+        <w:pStyle w:val="ListeParagraf"/>
+        <w:spacing w:after="0" w:line="240" w:lineRule="auto"/>
+      </w:pPr>
+      <w:r>
+        <w:t>('Sefiller', '9780140444308', '1862-01-01', 'Penguin', 6, 4, 2, 'R4'),</w:t>
+      </w:r>
+    </w:p>
+    <w:p>
+      <w:pPr>
+        <w:pStyle w:val="ListeParagraf"/>
+        <w:spacing w:after="0" w:line="240" w:lineRule="auto"/>
+      </w:pPr>
+      <w:r>
+        <w:t>('İnsanlığın Geleceği', '9780062316097', '2015-01-01', 'Harper', 3, 6, 6, 'R5'),</w:t>
+      </w:r>
+    </w:p>
+    <w:p>
+      <w:pPr>
+        <w:pStyle w:val="ListeParagraf"/>
+        <w:spacing w:after="0" w:line="240" w:lineRule="auto"/>
+      </w:pPr>
+      <w:r>
+        <w:t>('Dönüşüm', '9780156628709', '1915-01-01', 'Schocken', 4, 5, 5, 'R6'),</w:t>
+      </w:r>
+    </w:p>
+    <w:p>
+      <w:pPr>
+        <w:pStyle w:val="ListeParagraf"/>
+        <w:spacing w:after="0" w:line="240" w:lineRule="auto"/>
+      </w:pPr>
+      <w:r>
+        <w:t>('Körlük', '9780156007757', '1995-10-01', 'Harvest', 8, 8, 8, 'R7'),</w:t>
+      </w:r>
+    </w:p>
+    <w:p>
+      <w:pPr>
+        <w:pStyle w:val="ListeParagraf"/>
+        <w:spacing w:after="0" w:line="240" w:lineRule="auto"/>
+      </w:pPr>
+      <w:r>
+        <w:t>('Monte Cristo Kontu', '9780140449266', '1844-01-01', 'Penguin', 9, 1, 9, 'R8'),</w:t>
+      </w:r>
+    </w:p>
+    <w:p>
+      <w:pPr>
+        <w:pStyle w:val="ListeParagraf"/>
+        <w:spacing w:after="0" w:line="240" w:lineRule="auto"/>
+      </w:pPr>
+      <w:r>
+        <w:t>('Silmarillion', '9780618391110', '1977-01-01', 'Houghton', 6, 10, 10, 'R9'),</w:t>
+      </w:r>
+    </w:p>
+    <w:p>
+      <w:pPr>
+        <w:pStyle w:val="ListeParagraf"/>
+        <w:spacing w:after="0" w:line="240" w:lineRule="auto"/>
+      </w:pPr>
+      <w:r>
+        <w:t>('Kumral Ada Mavi Tuna', '9789750809012', '1997-06-01', 'YKY', 2, 1, 1, 'R10');</w:t>
+      </w:r>
+    </w:p>
+    <w:p>
+      <w:pPr>
+        <w:pStyle w:val="ListeParagraf"/>
+        <w:spacing w:after="0" w:line="240" w:lineRule="auto"/>
+        <w:rPr>
+          <w:b/>
+        </w:rPr>
+      </w:pPr>
+    </w:p>
+    <w:p>
+      <w:pPr>
+        <w:pStyle w:val="ListeParagraf"/>
+        <w:spacing w:after="0" w:line="240" w:lineRule="auto"/>
+        <w:rPr>
+          <w:b/>
+        </w:rPr>
+      </w:pPr>
+    </w:p>
+    <w:p>
+      <w:pPr>
+        <w:pStyle w:val="ListeParagraf"/>
+        <w:spacing w:after="0" w:line="240" w:lineRule="auto"/>
+        <w:rPr>
+          <w:b/>
+        </w:rPr>
+      </w:pPr>
+    </w:p>
+    <w:p>
+      <w:pPr>
+        <w:pStyle w:val="ListeParagraf"/>
+        <w:spacing w:after="0" w:line="240" w:lineRule="auto"/>
+        <w:rPr>
+          <w:b/>
+        </w:rPr>
+      </w:pPr>
+    </w:p>
+    <w:p>
+      <w:pPr>
+        <w:pStyle w:val="ListeParagraf"/>
+        <w:spacing w:after="0" w:line="240" w:lineRule="auto"/>
+        <w:rPr>
+          <w:b/>
+        </w:rPr>
+      </w:pPr>
+      <w:r>
+        <w:rPr>
+          <w:b/>
+        </w:rPr>
+        <w:t>INSERT INTO Uye (UyeAdi, UyeSoyad, Email, TelNo, Adres) VALUES</w:t>
+      </w:r>
+    </w:p>
+    <w:p>
+      <w:pPr>
+        <w:pStyle w:val="ListeParagraf"/>
+        <w:spacing w:after="0" w:line="240" w:lineRule="auto"/>
+      </w:pPr>
+      <w:r>
+        <w:t>('Ahmet', 'Demir', 'ahmet@gmail.com', '05551112233', 'Ankara'),</w:t>
+      </w:r>
+    </w:p>
+    <w:p>
+      <w:pPr>
+        <w:pStyle w:val="ListeParagraf"/>
+        <w:spacing w:after="0" w:line="240" w:lineRule="auto"/>
+      </w:pPr>
+      <w:r>
+        <w:t>('Ayşe', 'Yıldız', 'ayse@gmail.com', '05556667788', 'İstanbul'),</w:t>
+      </w:r>
+    </w:p>
+    <w:p>
+      <w:pPr>
+        <w:pStyle w:val="ListeParagraf"/>
+        <w:spacing w:after="0" w:line="240" w:lineRule="auto"/>
+      </w:pPr>
+      <w:r>
+        <w:t>('Mehmet', 'Kaya', 'mehmet@gmail.com', '05337779911', 'İzmir'),</w:t>
+      </w:r>
+    </w:p>
+    <w:p>
+      <w:pPr>
+        <w:pStyle w:val="ListeParagraf"/>
+        <w:spacing w:after="0" w:line="240" w:lineRule="auto"/>
+      </w:pPr>
+      <w:r>
+        <w:t>('Fatma', 'Çelik', 'fatma@gmail.com', '05336668899', 'Bursa'),</w:t>
+      </w:r>
+    </w:p>
+    <w:p>
+      <w:pPr>
+        <w:pStyle w:val="ListeParagraf"/>
+        <w:spacing w:after="0" w:line="240" w:lineRule="auto"/>
+      </w:pPr>
+      <w:r>
+        <w:t>('Ali', 'Yılmaz', 'ali@gmail.com', '05335557722', 'Antalya'),</w:t>
+      </w:r>
+    </w:p>
+    <w:p>
+      <w:pPr>
+        <w:pStyle w:val="ListeParagraf"/>
+        <w:spacing w:after="0" w:line="240" w:lineRule="auto"/>
+      </w:pPr>
+      <w:r>
+        <w:t>('Zeynep', 'Şahin', 'zeynep@gmail.com', '05324446677', 'Adana'),</w:t>
+      </w:r>
+    </w:p>
+    <w:p>
+      <w:pPr>
+        <w:pStyle w:val="ListeParagraf"/>
+        <w:spacing w:after="0" w:line="240" w:lineRule="auto"/>
+      </w:pPr>
+      <w:r>
+        <w:t>('Emre', 'Turan', 'emre@gmail.com', '05443332255', 'Gaziantep'),</w:t>
+      </w:r>
+    </w:p>
+    <w:p>
+      <w:pPr>
+        <w:pStyle w:val="ListeParagraf"/>
+        <w:spacing w:after="0" w:line="240" w:lineRule="auto"/>
+      </w:pPr>
+      <w:r>
+        <w:t>('Ece', 'Aydın', 'ece@gmail.com', '05443332266', 'Trabzon'),</w:t>
+      </w:r>
+    </w:p>
+    <w:p>
+      <w:pPr>
+        <w:pStyle w:val="ListeParagraf"/>
+        <w:spacing w:after="0" w:line="240" w:lineRule="auto"/>
+      </w:pPr>
+      <w:r>
+        <w:t>('Hüseyin', 'Yıldırım', 'huseyin@gmail.com', '05447778899', 'Mersin'),</w:t>
+      </w:r>
+    </w:p>
+    <w:p>
+      <w:pPr>
+        <w:pStyle w:val="ListeParagraf"/>
+        <w:spacing w:after="0" w:line="240" w:lineRule="auto"/>
+      </w:pPr>
+      <w:r>
+        <w:t>('Ceren', 'Demirtaş', 'ceren@gmail.com', '05321112233', 'Kocaeli');</w:t>
+      </w:r>
+    </w:p>
+    <w:p>
+      <w:pPr>
+        <w:pStyle w:val="ListeParagraf"/>
+        <w:spacing w:after="0" w:line="240" w:lineRule="auto"/>
+        <w:rPr>
+          <w:b/>
+        </w:rPr>
+      </w:pPr>
+    </w:p>
+    <w:p>
+      <w:pPr>
+        <w:pStyle w:val="ListeParagraf"/>
+        <w:spacing w:after="0" w:line="240" w:lineRule="auto"/>
+        <w:rPr>
+          <w:b/>
+        </w:rPr>
+      </w:pPr>
+    </w:p>
+    <w:p>
+      <w:pPr>
+        <w:pStyle w:val="ListeParagraf"/>
+        <w:spacing w:after="0" w:line="240" w:lineRule="auto"/>
+        <w:rPr>
+          <w:b/>
+        </w:rPr>
+      </w:pPr>
+    </w:p>
+    <w:p>
+      <w:pPr>
+        <w:pStyle w:val="ListeParagraf"/>
+        <w:spacing w:after="0" w:line="240" w:lineRule="auto"/>
+        <w:rPr>
+          <w:b/>
+        </w:rPr>
+      </w:pPr>
+    </w:p>
+    <w:p>
+      <w:pPr>
+        <w:pStyle w:val="ListeParagraf"/>
+        <w:spacing w:after="0" w:line="240" w:lineRule="auto"/>
+        <w:rPr>
+          <w:b/>
+        </w:rPr>
+      </w:pPr>
+      <w:r>
+        <w:rPr>
+          <w:b/>
+        </w:rPr>
+        <w:t>INSERT INTO Personel (PerAdi, PerSoyad, TelNo, Email) VALUES</w:t>
+      </w:r>
+    </w:p>
+    <w:p>
+      <w:pPr>
+        <w:pStyle w:val="ListeParagraf"/>
+        <w:spacing w:after="0" w:line="240" w:lineRule="auto"/>
+      </w:pPr>
+      <w:r>
+        <w:t>('Mehmet', 'Kaya', '05336668899', 'mehmet.kaya@kutuphane.com'),</w:t>
+      </w:r>
+    </w:p>
+    <w:p>
+      <w:pPr>
+        <w:pStyle w:val="ListeParagraf"/>
+        <w:spacing w:after="0" w:line="240" w:lineRule="auto"/>
+      </w:pPr>
+      <w:r>
+        <w:t>('Ayşe', 'Demir', '05336668877', 'ayse.demir@kutuphane.com'),</w:t>
+      </w:r>
+    </w:p>
+    <w:p>
+      <w:pPr>
+        <w:pStyle w:val="ListeParagraf"/>
+        <w:spacing w:after="0" w:line="240" w:lineRule="auto"/>
+      </w:pPr>
+      <w:r>
+        <w:t>('Fatma', 'Turan', '05331112233', 'fatma.turan@kutuphane.com'),</w:t>
+      </w:r>
+    </w:p>
+    <w:p>
+      <w:pPr>
+        <w:pStyle w:val="ListeParagraf"/>
+        <w:spacing w:after="0" w:line="240" w:lineRule="auto"/>
+      </w:pPr>
+      <w:r>
+        <w:t>('Ali', 'Yıldız', '05332224455', 'ali.yildiz@kutuphane.com'),</w:t>
+      </w:r>
+    </w:p>
+    <w:p>
+      <w:pPr>
+        <w:pStyle w:val="ListeParagraf"/>
+        <w:spacing w:after="0" w:line="240" w:lineRule="auto"/>
+      </w:pPr>
+      <w:r>
+        <w:t>('Ahmet', 'Şahin', '05337778899', 'ahmet.sahin@kutuphane.com'),</w:t>
+      </w:r>
+    </w:p>
+    <w:p>
+      <w:pPr>
+        <w:pStyle w:val="ListeParagraf"/>
+        <w:spacing w:after="0" w:line="240" w:lineRule="auto"/>
+      </w:pPr>
+      <w:r>
+        <w:t>('Zeynep', 'Kara', '05333334455', 'zeynep.kara@kutuphane.com'),</w:t>
+      </w:r>
+    </w:p>
+    <w:p>
+      <w:pPr>
+        <w:pStyle w:val="ListeParagraf"/>
+        <w:spacing w:after="0" w:line="240" w:lineRule="auto"/>
+      </w:pPr>
+      <w:r>
+        <w:t>('Emre', 'Aydın', '05336663377', 'emre.aydin@kutuphane.com'),</w:t>
+      </w:r>
+    </w:p>
+    <w:p>
+      <w:pPr>
+        <w:pStyle w:val="ListeParagraf"/>
+        <w:spacing w:after="0" w:line="240" w:lineRule="auto"/>
+      </w:pPr>
+      <w:r>
+        <w:t>('Ece', 'Çelik', '05331119955', 'ece.celik@kutuphane.com'),</w:t>
+      </w:r>
+    </w:p>
+    <w:p>
+      <w:pPr>
+        <w:pStyle w:val="ListeParagraf"/>
+        <w:spacing w:after="0" w:line="240" w:lineRule="auto"/>
+      </w:pPr>
+      <w:r>
+        <w:t>('Hüseyin', 'Demirtaş', '05335557766', 'huseyin.demirtas@kutuphane.com'),</w:t>
+      </w:r>
+    </w:p>
+    <w:p>
+      <w:pPr>
+        <w:pStyle w:val="ListeParagraf"/>
+        <w:spacing w:after="0" w:line="240" w:lineRule="auto"/>
+      </w:pPr>
+      <w:r>
+        <w:t>('Ceren', 'Kılıç', '05333335588', 'ceren.kilic@kutuphane.com');</w:t>
+      </w:r>
+    </w:p>
+    <w:p>
+      <w:pPr>
+        <w:pStyle w:val="ListeParagraf"/>
+        <w:spacing w:after="0" w:line="240" w:lineRule="auto"/>
+        <w:rPr>
+          <w:b/>
+        </w:rPr>
+      </w:pPr>
+    </w:p>
+    <w:p>
+      <w:pPr>
+        <w:pStyle w:val="ListeParagraf"/>
+        <w:spacing w:after="0" w:line="240" w:lineRule="auto"/>
+        <w:rPr>
+          <w:b/>
+        </w:rPr>
+      </w:pPr>
+    </w:p>
+    <w:p>
+      <w:pPr>
+        <w:pStyle w:val="ListeParagraf"/>
+        <w:spacing w:after="0" w:line="240" w:lineRule="auto"/>
+        <w:rPr>
+          <w:b/>
+        </w:rPr>
+      </w:pPr>
+    </w:p>
+    <w:p>
+      <w:pPr>
+        <w:pStyle w:val="ListeParagraf"/>
+        <w:spacing w:after="0" w:line="240" w:lineRule="auto"/>
+        <w:rPr>
+          <w:b/>
+        </w:rPr>
+      </w:pPr>
+    </w:p>
+    <w:p>
+      <w:pPr>
+        <w:pStyle w:val="ListeParagraf"/>
         <w:spacing w:after="0" w:line="240" w:lineRule="auto"/>
         <w:rPr>
           <w:b/>
@@ -1310,959 +2838,456 @@
           <w:b/>
         </w:rPr>
         <w:lastRenderedPageBreak/>
-        <w:t>Tablo Görselleri</w:t>
-      </w:r>
-    </w:p>
-    <w:p>
-      <w:pPr>
-        <w:spacing w:after="0" w:line="240" w:lineRule="auto"/>
-        <w:ind w:left="1080" w:firstLine="360"/>
-        <w:rPr>
-          <w:b/>
-        </w:rPr>
-      </w:pPr>
-      <w:r>
-        <w:rPr>
-          <w:b/>
-        </w:rPr>
-        <w:t>Kategor</w:t>
-      </w:r>
-      <w:r>
-        <w:rPr>
-          <w:b/>
-        </w:rPr>
-        <w:t>i</w:t>
-      </w:r>
-    </w:p>
-    <w:p>
-      <w:pPr>
-        <w:spacing w:after="0" w:line="240" w:lineRule="auto"/>
-        <w:ind w:left="1080" w:firstLine="360"/>
-        <w:rPr>
-          <w:b/>
-        </w:rPr>
-      </w:pPr>
-      <w:r>
-        <w:rPr>
-          <w:b/>
-          <w:noProof/>
-          <w:lang w:eastAsia="tr-TR"/>
-        </w:rPr>
-        <w:drawing>
-          <wp:inline distT="0" distB="0" distL="0" distR="0">
-            <wp:extent cx="4895850" cy="3527470"/>
-            <wp:effectExtent l="19050" t="0" r="0" b="0"/>
-            <wp:docPr id="21" name="Resim 134" descr="C:\Users\YUSUF\AppData\Local\Microsoft\Windows\INetCache\Content.Word\Ekran görüntüsü 2024-11-20 124000.png"/>
-            <wp:cNvGraphicFramePr>
-              <a:graphicFrameLocks xmlns:a="http://schemas.openxmlformats.org/drawingml/2006/main" noChangeAspect="1"/>
-            </wp:cNvGraphicFramePr>
-            <a:graphic xmlns:a="http://schemas.openxmlformats.org/drawingml/2006/main">
-              <a:graphicData uri="http://schemas.openxmlformats.org/drawingml/2006/picture">
-                <pic:pic xmlns:pic="http://schemas.openxmlformats.org/drawingml/2006/picture">
-                  <pic:nvPicPr>
-                    <pic:cNvPr id="0" name="Picture 134" descr="C:\Users\YUSUF\AppData\Local\Microsoft\Windows\INetCache\Content.Word\Ekran görüntüsü 2024-11-20 124000.png"/>
-                    <pic:cNvPicPr>
-                      <a:picLocks noChangeAspect="1" noChangeArrowheads="1"/>
-                    </pic:cNvPicPr>
-                  </pic:nvPicPr>
-                  <pic:blipFill>
-                    <a:blip r:embed="rId7"/>
-                    <a:srcRect/>
-                    <a:stretch>
-                      <a:fillRect/>
-                    </a:stretch>
-                  </pic:blipFill>
-                  <pic:spPr bwMode="auto">
-                    <a:xfrm>
-                      <a:off x="0" y="0"/>
-                      <a:ext cx="4895971" cy="3527557"/>
-                    </a:xfrm>
-                    <a:prstGeom prst="rect">
-                      <a:avLst/>
-                    </a:prstGeom>
-                    <a:noFill/>
-                    <a:ln w="9525">
-                      <a:noFill/>
-                      <a:miter lim="800000"/>
-                      <a:headEnd/>
-                      <a:tailEnd/>
-                    </a:ln>
-                  </pic:spPr>
-                </pic:pic>
-              </a:graphicData>
-            </a:graphic>
-          </wp:inline>
-        </w:drawing>
-      </w:r>
-    </w:p>
-    <w:p>
-      <w:pPr>
-        <w:spacing w:after="0" w:line="240" w:lineRule="auto"/>
-        <w:rPr>
-          <w:b/>
-        </w:rPr>
-      </w:pPr>
-    </w:p>
-    <w:p>
-      <w:pPr>
-        <w:spacing w:after="0" w:line="240" w:lineRule="auto"/>
-        <w:ind w:left="720" w:firstLine="720"/>
-        <w:rPr>
-          <w:b/>
-        </w:rPr>
-      </w:pPr>
-      <w:r>
-        <w:rPr>
-          <w:b/>
-        </w:rPr>
-        <w:t>Yaza</w:t>
-      </w:r>
-      <w:r>
-        <w:rPr>
-          <w:b/>
-        </w:rPr>
-        <w:t>r</w:t>
-      </w:r>
-    </w:p>
-    <w:p>
-      <w:pPr>
-        <w:spacing w:after="0" w:line="240" w:lineRule="auto"/>
-        <w:ind w:left="720" w:firstLine="720"/>
-        <w:rPr>
-          <w:b/>
-        </w:rPr>
-      </w:pPr>
-      <w:r>
-        <w:rPr>
-          <w:b/>
-          <w:noProof/>
-          <w:lang w:eastAsia="tr-TR"/>
-        </w:rPr>
-        <w:drawing>
-          <wp:inline distT="0" distB="0" distL="0" distR="0">
-            <wp:extent cx="4902420" cy="3104866"/>
-            <wp:effectExtent l="19050" t="0" r="0" b="0"/>
-            <wp:docPr id="22" name="Resim 138" descr="C:\Users\YUSUF\AppData\Local\Microsoft\Windows\INetCache\Content.Word\Ekran görüntüsü 2024-11-20 124202.png"/>
-            <wp:cNvGraphicFramePr>
-              <a:graphicFrameLocks xmlns:a="http://schemas.openxmlformats.org/drawingml/2006/main" noChangeAspect="1"/>
-            </wp:cNvGraphicFramePr>
-            <a:graphic xmlns:a="http://schemas.openxmlformats.org/drawingml/2006/main">
-              <a:graphicData uri="http://schemas.openxmlformats.org/drawingml/2006/picture">
-                <pic:pic xmlns:pic="http://schemas.openxmlformats.org/drawingml/2006/picture">
-                  <pic:nvPicPr>
-                    <pic:cNvPr id="0" name="Picture 138" descr="C:\Users\YUSUF\AppData\Local\Microsoft\Windows\INetCache\Content.Word\Ekran görüntüsü 2024-11-20 124202.png"/>
-                    <pic:cNvPicPr>
-                      <a:picLocks noChangeAspect="1" noChangeArrowheads="1"/>
-                    </pic:cNvPicPr>
-                  </pic:nvPicPr>
-                  <pic:blipFill>
-                    <a:blip r:embed="rId8"/>
-                    <a:srcRect/>
-                    <a:stretch>
-                      <a:fillRect/>
-                    </a:stretch>
-                  </pic:blipFill>
-                  <pic:spPr bwMode="auto">
-                    <a:xfrm>
-                      <a:off x="0" y="0"/>
-                      <a:ext cx="4907845" cy="3108302"/>
-                    </a:xfrm>
-                    <a:prstGeom prst="rect">
-                      <a:avLst/>
-                    </a:prstGeom>
-                    <a:noFill/>
-                    <a:ln w="9525">
-                      <a:noFill/>
-                      <a:miter lim="800000"/>
-                      <a:headEnd/>
-                      <a:tailEnd/>
-                    </a:ln>
-                  </pic:spPr>
-                </pic:pic>
-              </a:graphicData>
-            </a:graphic>
-          </wp:inline>
-        </w:drawing>
-      </w:r>
-    </w:p>
-    <w:p>
-      <w:pPr>
-        <w:spacing w:after="0" w:line="240" w:lineRule="auto"/>
-        <w:ind w:left="720" w:firstLine="720"/>
-        <w:rPr>
-          <w:b/>
-        </w:rPr>
-      </w:pPr>
-    </w:p>
-    <w:p>
-      <w:pPr>
-        <w:spacing w:after="0" w:line="240" w:lineRule="auto"/>
-        <w:ind w:left="720" w:firstLine="720"/>
-        <w:rPr>
-          <w:b/>
-        </w:rPr>
-      </w:pPr>
-    </w:p>
-    <w:p>
-      <w:pPr>
-        <w:spacing w:after="0" w:line="240" w:lineRule="auto"/>
-        <w:ind w:left="720" w:firstLine="720"/>
-        <w:rPr>
-          <w:b/>
-        </w:rPr>
-      </w:pPr>
-    </w:p>
-    <w:p>
-      <w:pPr>
-        <w:spacing w:after="0" w:line="240" w:lineRule="auto"/>
-        <w:ind w:left="720" w:firstLine="720"/>
-        <w:rPr>
-          <w:b/>
-        </w:rPr>
-      </w:pPr>
-    </w:p>
-    <w:p>
-      <w:pPr>
-        <w:spacing w:after="0" w:line="240" w:lineRule="auto"/>
-        <w:ind w:left="720" w:firstLine="720"/>
-        <w:rPr>
-          <w:b/>
-        </w:rPr>
-      </w:pPr>
-    </w:p>
-    <w:p>
-      <w:pPr>
-        <w:spacing w:after="0" w:line="240" w:lineRule="auto"/>
-        <w:ind w:left="720" w:firstLine="720"/>
-        <w:rPr>
-          <w:b/>
-        </w:rPr>
-      </w:pPr>
-    </w:p>
-    <w:p>
-      <w:pPr>
-        <w:spacing w:after="0" w:line="240" w:lineRule="auto"/>
-        <w:ind w:left="720" w:firstLine="720"/>
-        <w:rPr>
-          <w:b/>
-        </w:rPr>
-      </w:pPr>
-      <w:r>
-        <w:rPr>
-          <w:b/>
-        </w:rPr>
-        <w:t>Kita</w:t>
-      </w:r>
-      <w:r>
-        <w:rPr>
-          <w:b/>
-        </w:rPr>
-        <w:t>p</w:t>
-      </w:r>
-    </w:p>
-    <w:p>
-      <w:pPr>
-        <w:spacing w:after="0" w:line="240" w:lineRule="auto"/>
-        <w:ind w:left="720" w:firstLine="720"/>
-        <w:rPr>
-          <w:b/>
-        </w:rPr>
-      </w:pPr>
-      <w:r>
-        <w:rPr>
-          <w:b/>
-          <w:noProof/>
-          <w:lang w:eastAsia="tr-TR"/>
-        </w:rPr>
-        <w:drawing>
-          <wp:inline distT="0" distB="0" distL="0" distR="0">
-            <wp:extent cx="4696251" cy="1229254"/>
-            <wp:effectExtent l="19050" t="0" r="9099" b="0"/>
-            <wp:docPr id="25" name="Resim 153" descr="C:\Users\YUSUF\AppData\Local\Microsoft\Windows\INetCache\Content.Word\Ekran görüntüsü 2024-11-20 124110.png"/>
-            <wp:cNvGraphicFramePr>
-              <a:graphicFrameLocks xmlns:a="http://schemas.openxmlformats.org/drawingml/2006/main" noChangeAspect="1"/>
-            </wp:cNvGraphicFramePr>
-            <a:graphic xmlns:a="http://schemas.openxmlformats.org/drawingml/2006/main">
-              <a:graphicData uri="http://schemas.openxmlformats.org/drawingml/2006/picture">
-                <pic:pic xmlns:pic="http://schemas.openxmlformats.org/drawingml/2006/picture">
-                  <pic:nvPicPr>
-                    <pic:cNvPr id="0" name="Picture 153" descr="C:\Users\YUSUF\AppData\Local\Microsoft\Windows\INetCache\Content.Word\Ekran görüntüsü 2024-11-20 124110.png"/>
-                    <pic:cNvPicPr>
-                      <a:picLocks noChangeAspect="1" noChangeArrowheads="1"/>
-                    </pic:cNvPicPr>
-                  </pic:nvPicPr>
-                  <pic:blipFill>
-                    <a:blip r:embed="rId9"/>
-                    <a:srcRect/>
-                    <a:stretch>
-                      <a:fillRect/>
-                    </a:stretch>
-                  </pic:blipFill>
-                  <pic:spPr bwMode="auto">
-                    <a:xfrm>
-                      <a:off x="0" y="0"/>
-                      <a:ext cx="4703340" cy="1231110"/>
-                    </a:xfrm>
-                    <a:prstGeom prst="rect">
-                      <a:avLst/>
-                    </a:prstGeom>
-                    <a:noFill/>
-                    <a:ln w="9525">
-                      <a:noFill/>
-                      <a:miter lim="800000"/>
-                      <a:headEnd/>
-                      <a:tailEnd/>
-                    </a:ln>
-                  </pic:spPr>
-                </pic:pic>
-              </a:graphicData>
-            </a:graphic>
-          </wp:inline>
-        </w:drawing>
-      </w:r>
-    </w:p>
-    <w:p>
-      <w:pPr>
-        <w:spacing w:after="0" w:line="240" w:lineRule="auto"/>
-        <w:ind w:left="720" w:firstLine="720"/>
-        <w:rPr>
-          <w:b/>
-        </w:rPr>
-      </w:pPr>
-    </w:p>
-    <w:p>
-      <w:pPr>
-        <w:spacing w:after="0" w:line="240" w:lineRule="auto"/>
-        <w:ind w:left="720" w:firstLine="720"/>
-        <w:rPr>
-          <w:b/>
-        </w:rPr>
-      </w:pPr>
-      <w:r>
-        <w:rPr>
-          <w:b/>
-        </w:rPr>
-        <w:t>Raf</w:t>
-      </w:r>
-    </w:p>
-    <w:p>
-      <w:pPr>
-        <w:spacing w:after="0" w:line="240" w:lineRule="auto"/>
-        <w:ind w:left="720" w:firstLine="720"/>
-        <w:rPr>
-          <w:b/>
-        </w:rPr>
-      </w:pPr>
-      <w:r>
-        <w:rPr>
-          <w:b/>
-          <w:noProof/>
-          <w:lang w:eastAsia="tr-TR"/>
-        </w:rPr>
-        <w:drawing>
-          <wp:inline distT="0" distB="0" distL="0" distR="0">
-            <wp:extent cx="4757666" cy="3418764"/>
-            <wp:effectExtent l="19050" t="0" r="4834" b="0"/>
-            <wp:docPr id="28" name="Resim 160" descr="C:\Users\YUSUF\AppData\Local\Microsoft\Windows\INetCache\Content.Word\Ekran görüntüsü 2024-11-20 124137.png"/>
-            <wp:cNvGraphicFramePr>
-              <a:graphicFrameLocks xmlns:a="http://schemas.openxmlformats.org/drawingml/2006/main" noChangeAspect="1"/>
-            </wp:cNvGraphicFramePr>
-            <a:graphic xmlns:a="http://schemas.openxmlformats.org/drawingml/2006/main">
-              <a:graphicData uri="http://schemas.openxmlformats.org/drawingml/2006/picture">
-                <pic:pic xmlns:pic="http://schemas.openxmlformats.org/drawingml/2006/picture">
-                  <pic:nvPicPr>
-                    <pic:cNvPr id="0" name="Picture 160" descr="C:\Users\YUSUF\AppData\Local\Microsoft\Windows\INetCache\Content.Word\Ekran görüntüsü 2024-11-20 124137.png"/>
-                    <pic:cNvPicPr>
-                      <a:picLocks noChangeAspect="1" noChangeArrowheads="1"/>
-                    </pic:cNvPicPr>
-                  </pic:nvPicPr>
-                  <pic:blipFill>
-                    <a:blip r:embed="rId10"/>
-                    <a:srcRect/>
-                    <a:stretch>
-                      <a:fillRect/>
-                    </a:stretch>
-                  </pic:blipFill>
-                  <pic:spPr bwMode="auto">
-                    <a:xfrm>
-                      <a:off x="0" y="0"/>
-                      <a:ext cx="4757772" cy="3418840"/>
-                    </a:xfrm>
-                    <a:prstGeom prst="rect">
-                      <a:avLst/>
-                    </a:prstGeom>
-                    <a:noFill/>
-                    <a:ln w="9525">
-                      <a:noFill/>
-                      <a:miter lim="800000"/>
-                      <a:headEnd/>
-                      <a:tailEnd/>
-                    </a:ln>
-                  </pic:spPr>
-                </pic:pic>
-              </a:graphicData>
-            </a:graphic>
-          </wp:inline>
-        </w:drawing>
-      </w:r>
-    </w:p>
-    <w:p>
-      <w:pPr>
-        <w:spacing w:after="0" w:line="240" w:lineRule="auto"/>
-        <w:ind w:left="720" w:firstLine="720"/>
-        <w:rPr>
-          <w:b/>
-        </w:rPr>
-      </w:pPr>
-    </w:p>
-    <w:p>
-      <w:pPr>
-        <w:spacing w:after="0" w:line="240" w:lineRule="auto"/>
-        <w:ind w:left="720" w:firstLine="720"/>
-        <w:rPr>
-          <w:b/>
-        </w:rPr>
-      </w:pPr>
-      <w:r>
-        <w:rPr>
-          <w:b/>
-        </w:rPr>
-        <w:t>Üye</w:t>
-      </w:r>
-    </w:p>
-    <w:p>
-      <w:pPr>
-        <w:spacing w:after="0" w:line="240" w:lineRule="auto"/>
-        <w:ind w:left="720" w:firstLine="720"/>
-        <w:rPr>
-          <w:b/>
-        </w:rPr>
-      </w:pPr>
-      <w:r>
-        <w:rPr>
-          <w:b/>
-          <w:noProof/>
-          <w:lang w:eastAsia="tr-TR"/>
-        </w:rPr>
-        <w:drawing>
-          <wp:inline distT="0" distB="0" distL="0" distR="0">
-            <wp:extent cx="4853201" cy="1834448"/>
-            <wp:effectExtent l="19050" t="0" r="4549" b="0"/>
-            <wp:docPr id="173" name="Resim 173" descr="C:\Users\YUSUF\AppData\Local\Microsoft\Windows\INetCache\Content.Word\Ekran görüntüsü 2024-11-20 124154.png"/>
-            <wp:cNvGraphicFramePr>
-              <a:graphicFrameLocks xmlns:a="http://schemas.openxmlformats.org/drawingml/2006/main" noChangeAspect="1"/>
-            </wp:cNvGraphicFramePr>
-            <a:graphic xmlns:a="http://schemas.openxmlformats.org/drawingml/2006/main">
-              <a:graphicData uri="http://schemas.openxmlformats.org/drawingml/2006/picture">
-                <pic:pic xmlns:pic="http://schemas.openxmlformats.org/drawingml/2006/picture">
-                  <pic:nvPicPr>
-                    <pic:cNvPr id="0" name="Picture 173" descr="C:\Users\YUSUF\AppData\Local\Microsoft\Windows\INetCache\Content.Word\Ekran görüntüsü 2024-11-20 124154.png"/>
-                    <pic:cNvPicPr>
-                      <a:picLocks noChangeAspect="1" noChangeArrowheads="1"/>
-                    </pic:cNvPicPr>
-                  </pic:nvPicPr>
-                  <pic:blipFill>
-                    <a:blip r:embed="rId11"/>
-                    <a:srcRect/>
-                    <a:stretch>
-                      <a:fillRect/>
-                    </a:stretch>
-                  </pic:blipFill>
-                  <pic:spPr bwMode="auto">
-                    <a:xfrm>
-                      <a:off x="0" y="0"/>
-                      <a:ext cx="4862272" cy="1837877"/>
-                    </a:xfrm>
-                    <a:prstGeom prst="rect">
-                      <a:avLst/>
-                    </a:prstGeom>
-                    <a:noFill/>
-                    <a:ln w="9525">
-                      <a:noFill/>
-                      <a:miter lim="800000"/>
-                      <a:headEnd/>
-                      <a:tailEnd/>
-                    </a:ln>
-                  </pic:spPr>
-                </pic:pic>
-              </a:graphicData>
-            </a:graphic>
-          </wp:inline>
-        </w:drawing>
-      </w:r>
-    </w:p>
-    <w:p>
-      <w:pPr>
-        <w:spacing w:after="0" w:line="240" w:lineRule="auto"/>
-        <w:ind w:left="720" w:firstLine="720"/>
-        <w:rPr>
-          <w:b/>
-        </w:rPr>
-      </w:pPr>
-    </w:p>
-    <w:p>
-      <w:pPr>
-        <w:spacing w:after="0" w:line="240" w:lineRule="auto"/>
-        <w:ind w:left="720" w:firstLine="720"/>
-        <w:rPr>
-          <w:b/>
-        </w:rPr>
-      </w:pPr>
-    </w:p>
-    <w:p>
-      <w:pPr>
-        <w:spacing w:after="0" w:line="240" w:lineRule="auto"/>
-        <w:ind w:left="720" w:firstLine="720"/>
-        <w:rPr>
-          <w:b/>
-        </w:rPr>
-      </w:pPr>
-    </w:p>
-    <w:p>
-      <w:pPr>
-        <w:spacing w:after="0" w:line="240" w:lineRule="auto"/>
-        <w:ind w:left="720" w:firstLine="720"/>
-        <w:rPr>
-          <w:b/>
-        </w:rPr>
-      </w:pPr>
-    </w:p>
-    <w:p>
-      <w:pPr>
-        <w:spacing w:after="0" w:line="240" w:lineRule="auto"/>
-        <w:ind w:left="720" w:firstLine="720"/>
-        <w:rPr>
-          <w:b/>
-        </w:rPr>
-      </w:pPr>
-    </w:p>
-    <w:p>
-      <w:pPr>
-        <w:spacing w:after="0" w:line="240" w:lineRule="auto"/>
-        <w:ind w:left="720" w:firstLine="720"/>
-        <w:rPr>
-          <w:b/>
-        </w:rPr>
-      </w:pPr>
-      <w:r>
-        <w:rPr>
-          <w:b/>
-        </w:rPr>
-        <w:t>Personel</w:t>
-      </w:r>
-    </w:p>
-    <w:p>
-      <w:pPr>
-        <w:spacing w:after="0" w:line="240" w:lineRule="auto"/>
-        <w:ind w:left="720" w:firstLine="720"/>
-        <w:rPr>
-          <w:b/>
-        </w:rPr>
-      </w:pPr>
-      <w:r>
-        <w:rPr>
-          <w:b/>
-          <w:noProof/>
-          <w:lang w:eastAsia="tr-TR"/>
-        </w:rPr>
-        <w:drawing>
-          <wp:inline distT="0" distB="0" distL="0" distR="0">
-            <wp:extent cx="4778612" cy="1545126"/>
-            <wp:effectExtent l="19050" t="0" r="2938" b="0"/>
-            <wp:docPr id="29" name="Resim 178" descr="C:\Users\YUSUF\AppData\Local\Microsoft\Windows\INetCache\Content.Word\Ekran görüntüsü 2024-11-20 124131.png"/>
-            <wp:cNvGraphicFramePr>
-              <a:graphicFrameLocks xmlns:a="http://schemas.openxmlformats.org/drawingml/2006/main" noChangeAspect="1"/>
-            </wp:cNvGraphicFramePr>
-            <a:graphic xmlns:a="http://schemas.openxmlformats.org/drawingml/2006/main">
-              <a:graphicData uri="http://schemas.openxmlformats.org/drawingml/2006/picture">
-                <pic:pic xmlns:pic="http://schemas.openxmlformats.org/drawingml/2006/picture">
-                  <pic:nvPicPr>
-                    <pic:cNvPr id="0" name="Picture 178" descr="C:\Users\YUSUF\AppData\Local\Microsoft\Windows\INetCache\Content.Word\Ekran görüntüsü 2024-11-20 124131.png"/>
-                    <pic:cNvPicPr>
-                      <a:picLocks noChangeAspect="1" noChangeArrowheads="1"/>
-                    </pic:cNvPicPr>
-                  </pic:nvPicPr>
-                  <pic:blipFill>
-                    <a:blip r:embed="rId12"/>
-                    <a:srcRect/>
-                    <a:stretch>
-                      <a:fillRect/>
-                    </a:stretch>
-                  </pic:blipFill>
-                  <pic:spPr bwMode="auto">
-                    <a:xfrm>
-                      <a:off x="0" y="0"/>
-                      <a:ext cx="4782504" cy="1546384"/>
-                    </a:xfrm>
-                    <a:prstGeom prst="rect">
-                      <a:avLst/>
-                    </a:prstGeom>
-                    <a:noFill/>
-                    <a:ln w="9525">
-                      <a:noFill/>
-                      <a:miter lim="800000"/>
-                      <a:headEnd/>
-                      <a:tailEnd/>
-                    </a:ln>
-                  </pic:spPr>
-                </pic:pic>
-              </a:graphicData>
-            </a:graphic>
-          </wp:inline>
-        </w:drawing>
-      </w:r>
-    </w:p>
-    <w:p>
-      <w:pPr>
-        <w:spacing w:after="0" w:line="240" w:lineRule="auto"/>
-        <w:ind w:left="720" w:firstLine="720"/>
-        <w:rPr>
-          <w:b/>
-        </w:rPr>
-      </w:pPr>
-    </w:p>
-    <w:p>
-      <w:pPr>
-        <w:spacing w:after="0" w:line="240" w:lineRule="auto"/>
-        <w:ind w:left="1440"/>
-        <w:rPr>
-          <w:b/>
-        </w:rPr>
-      </w:pPr>
-      <w:r>
-        <w:rPr>
-          <w:b/>
-        </w:rPr>
-        <w:t>Ödün</w:t>
-      </w:r>
-      <w:r>
-        <w:rPr>
-          <w:b/>
-        </w:rPr>
-        <w:t>ç</w:t>
-      </w:r>
-      <w:r>
-        <w:rPr>
-          <w:b/>
-          <w:noProof/>
-          <w:lang w:eastAsia="tr-TR"/>
-        </w:rPr>
-        <w:drawing>
-          <wp:inline distT="0" distB="0" distL="0" distR="0">
-            <wp:extent cx="4709899" cy="2592468"/>
-            <wp:effectExtent l="19050" t="0" r="0" b="0"/>
-            <wp:docPr id="30" name="Resim 182" descr="C:\Users\YUSUF\AppData\Local\Microsoft\Windows\INetCache\Content.Word\Ekran görüntüsü 2024-11-20 124031.png"/>
-            <wp:cNvGraphicFramePr>
-              <a:graphicFrameLocks xmlns:a="http://schemas.openxmlformats.org/drawingml/2006/main" noChangeAspect="1"/>
-            </wp:cNvGraphicFramePr>
-            <a:graphic xmlns:a="http://schemas.openxmlformats.org/drawingml/2006/main">
-              <a:graphicData uri="http://schemas.openxmlformats.org/drawingml/2006/picture">
-                <pic:pic xmlns:pic="http://schemas.openxmlformats.org/drawingml/2006/picture">
-                  <pic:nvPicPr>
-                    <pic:cNvPr id="0" name="Picture 182" descr="C:\Users\YUSUF\AppData\Local\Microsoft\Windows\INetCache\Content.Word\Ekran görüntüsü 2024-11-20 124031.png"/>
-                    <pic:cNvPicPr>
-                      <a:picLocks noChangeAspect="1" noChangeArrowheads="1"/>
-                    </pic:cNvPicPr>
-                  </pic:nvPicPr>
-                  <pic:blipFill>
-                    <a:blip r:embed="rId13"/>
-                    <a:srcRect/>
-                    <a:stretch>
-                      <a:fillRect/>
-                    </a:stretch>
-                  </pic:blipFill>
-                  <pic:spPr bwMode="auto">
-                    <a:xfrm>
-                      <a:off x="0" y="0"/>
-                      <a:ext cx="4707934" cy="2591386"/>
-                    </a:xfrm>
-                    <a:prstGeom prst="rect">
-                      <a:avLst/>
-                    </a:prstGeom>
-                    <a:noFill/>
-                    <a:ln w="9525">
-                      <a:noFill/>
-                      <a:miter lim="800000"/>
-                      <a:headEnd/>
-                      <a:tailEnd/>
-                    </a:ln>
-                  </pic:spPr>
-                </pic:pic>
-              </a:graphicData>
-            </a:graphic>
-          </wp:inline>
-        </w:drawing>
-      </w:r>
-    </w:p>
-    <w:p>
-      <w:pPr>
-        <w:spacing w:after="0" w:line="240" w:lineRule="auto"/>
-        <w:ind w:left="1440"/>
-        <w:rPr>
-          <w:b/>
-        </w:rPr>
-      </w:pPr>
-    </w:p>
-    <w:p>
-      <w:pPr>
-        <w:spacing w:after="0" w:line="240" w:lineRule="auto"/>
-        <w:ind w:left="1440"/>
-        <w:rPr>
-          <w:b/>
-        </w:rPr>
-      </w:pPr>
-      <w:r>
-        <w:rPr>
-          <w:b/>
-        </w:rPr>
-        <w:t>Ceza</w:t>
-      </w:r>
-    </w:p>
-    <w:p>
-      <w:pPr>
-        <w:spacing w:after="0" w:line="240" w:lineRule="auto"/>
-        <w:ind w:left="1440"/>
-        <w:rPr>
-          <w:b/>
-        </w:rPr>
-      </w:pPr>
-      <w:r>
-        <w:rPr>
-          <w:b/>
-          <w:noProof/>
-          <w:lang w:eastAsia="tr-TR"/>
-        </w:rPr>
-        <w:drawing>
-          <wp:inline distT="0" distB="0" distL="0" distR="0">
-            <wp:extent cx="4855580" cy="1924334"/>
-            <wp:effectExtent l="19050" t="0" r="2170" b="0"/>
-            <wp:docPr id="188" name="Resim 188" descr="C:\Users\YUSUF\AppData\Local\Microsoft\Windows\INetCache\Content.Word\Ekran görüntüsü 2024-11-20 124013.png"/>
-            <wp:cNvGraphicFramePr>
-              <a:graphicFrameLocks xmlns:a="http://schemas.openxmlformats.org/drawingml/2006/main" noChangeAspect="1"/>
-            </wp:cNvGraphicFramePr>
-            <a:graphic xmlns:a="http://schemas.openxmlformats.org/drawingml/2006/main">
-              <a:graphicData uri="http://schemas.openxmlformats.org/drawingml/2006/picture">
-                <pic:pic xmlns:pic="http://schemas.openxmlformats.org/drawingml/2006/picture">
-                  <pic:nvPicPr>
-                    <pic:cNvPr id="0" name="Picture 188" descr="C:\Users\YUSUF\AppData\Local\Microsoft\Windows\INetCache\Content.Word\Ekran görüntüsü 2024-11-20 124013.png"/>
-                    <pic:cNvPicPr>
-                      <a:picLocks noChangeAspect="1" noChangeArrowheads="1"/>
-                    </pic:cNvPicPr>
-                  </pic:nvPicPr>
-                  <pic:blipFill>
-                    <a:blip r:embed="rId14"/>
-                    <a:srcRect/>
-                    <a:stretch>
-                      <a:fillRect/>
-                    </a:stretch>
-                  </pic:blipFill>
-                  <pic:spPr bwMode="auto">
-                    <a:xfrm>
-                      <a:off x="0" y="0"/>
-                      <a:ext cx="4861278" cy="1926592"/>
-                    </a:xfrm>
-                    <a:prstGeom prst="rect">
-                      <a:avLst/>
-                    </a:prstGeom>
-                    <a:noFill/>
-                    <a:ln w="9525">
-                      <a:noFill/>
-                      <a:miter lim="800000"/>
-                      <a:headEnd/>
-                      <a:tailEnd/>
-                    </a:ln>
-                  </pic:spPr>
-                </pic:pic>
-              </a:graphicData>
-            </a:graphic>
-          </wp:inline>
-        </w:drawing>
-      </w:r>
-    </w:p>
-    <w:p>
-      <w:pPr>
-        <w:spacing w:after="0" w:line="240" w:lineRule="auto"/>
-        <w:ind w:left="1440"/>
-        <w:rPr>
-          <w:b/>
-        </w:rPr>
-      </w:pPr>
-    </w:p>
-    <w:p>
-      <w:pPr>
-        <w:spacing w:after="0" w:line="240" w:lineRule="auto"/>
-        <w:ind w:left="1440"/>
-        <w:rPr>
-          <w:b/>
-        </w:rPr>
-      </w:pPr>
-    </w:p>
-    <w:p>
-      <w:pPr>
-        <w:spacing w:after="0" w:line="240" w:lineRule="auto"/>
-        <w:ind w:left="1440"/>
-        <w:rPr>
-          <w:b/>
-        </w:rPr>
-      </w:pPr>
-    </w:p>
-    <w:p>
-      <w:pPr>
-        <w:spacing w:after="0" w:line="240" w:lineRule="auto"/>
-        <w:ind w:left="1440"/>
-        <w:rPr>
-          <w:b/>
-        </w:rPr>
-      </w:pPr>
-    </w:p>
-    <w:p>
-      <w:pPr>
-        <w:spacing w:after="0" w:line="240" w:lineRule="auto"/>
-        <w:ind w:left="1440"/>
-        <w:rPr>
-          <w:b/>
-        </w:rPr>
-      </w:pPr>
-    </w:p>
-    <w:p>
-      <w:pPr>
-        <w:spacing w:after="0" w:line="240" w:lineRule="auto"/>
-        <w:ind w:left="1440"/>
-        <w:rPr>
-          <w:b/>
-        </w:rPr>
-      </w:pPr>
-    </w:p>
-    <w:p>
-      <w:pPr>
-        <w:spacing w:after="0" w:line="240" w:lineRule="auto"/>
-        <w:ind w:left="1440"/>
-        <w:rPr>
-          <w:b/>
-        </w:rPr>
-      </w:pPr>
-    </w:p>
-    <w:p>
-      <w:pPr>
-        <w:spacing w:after="0" w:line="240" w:lineRule="auto"/>
-        <w:ind w:left="1440"/>
-        <w:rPr>
-          <w:b/>
-        </w:rPr>
-      </w:pPr>
-    </w:p>
-    <w:p>
-      <w:pPr>
-        <w:spacing w:after="0" w:line="240" w:lineRule="auto"/>
-        <w:ind w:left="1440"/>
-        <w:rPr>
-          <w:b/>
-        </w:rPr>
-      </w:pPr>
-      <w:r>
-        <w:rPr>
-          <w:b/>
-        </w:rPr>
-        <w:t>Rezervasyon</w:t>
-      </w:r>
-    </w:p>
-    <w:p>
-      <w:pPr>
-        <w:spacing w:after="0" w:line="240" w:lineRule="auto"/>
-        <w:ind w:left="1440"/>
-        <w:rPr>
-          <w:b/>
-        </w:rPr>
-      </w:pPr>
-      <w:r>
-        <w:rPr>
-          <w:b/>
-          <w:noProof/>
-          <w:lang w:eastAsia="tr-TR"/>
-        </w:rPr>
-        <w:drawing>
-          <wp:inline distT="0" distB="0" distL="0" distR="0">
-            <wp:extent cx="4903930" cy="3487003"/>
-            <wp:effectExtent l="19050" t="0" r="0" b="0"/>
-            <wp:docPr id="33" name="Resim 191" descr="C:\Users\YUSUF\AppData\Local\Microsoft\Windows\INetCache\Content.Word\Ekran görüntüsü 2024-11-20 124144.png"/>
-            <wp:cNvGraphicFramePr>
-              <a:graphicFrameLocks xmlns:a="http://schemas.openxmlformats.org/drawingml/2006/main" noChangeAspect="1"/>
-            </wp:cNvGraphicFramePr>
-            <a:graphic xmlns:a="http://schemas.openxmlformats.org/drawingml/2006/main">
-              <a:graphicData uri="http://schemas.openxmlformats.org/drawingml/2006/picture">
-                <pic:pic xmlns:pic="http://schemas.openxmlformats.org/drawingml/2006/picture">
-                  <pic:nvPicPr>
-                    <pic:cNvPr id="0" name="Picture 191" descr="C:\Users\YUSUF\AppData\Local\Microsoft\Windows\INetCache\Content.Word\Ekran görüntüsü 2024-11-20 124144.png"/>
-                    <pic:cNvPicPr>
-                      <a:picLocks noChangeAspect="1" noChangeArrowheads="1"/>
-                    </pic:cNvPicPr>
-                  </pic:nvPicPr>
-                  <pic:blipFill>
-                    <a:blip r:embed="rId15"/>
-                    <a:srcRect/>
-                    <a:stretch>
-                      <a:fillRect/>
-                    </a:stretch>
-                  </pic:blipFill>
-                  <pic:spPr bwMode="auto">
-                    <a:xfrm>
-                      <a:off x="0" y="0"/>
-                      <a:ext cx="4913837" cy="3494047"/>
-                    </a:xfrm>
-                    <a:prstGeom prst="rect">
-                      <a:avLst/>
-                    </a:prstGeom>
-                    <a:noFill/>
-                    <a:ln w="9525">
-                      <a:noFill/>
-                      <a:miter lim="800000"/>
-                      <a:headEnd/>
-                      <a:tailEnd/>
-                    </a:ln>
-                  </pic:spPr>
-                </pic:pic>
-              </a:graphicData>
-            </a:graphic>
-          </wp:inline>
-        </w:drawing>
-      </w:r>
-    </w:p>
-    <w:p>
-      <w:pPr>
-        <w:spacing w:after="0" w:line="240" w:lineRule="auto"/>
-        <w:ind w:left="1440"/>
-        <w:rPr>
-          <w:b/>
-        </w:rPr>
-      </w:pPr>
-    </w:p>
-    <w:p>
-      <w:pPr>
-        <w:spacing w:after="0" w:line="240" w:lineRule="auto"/>
-        <w:ind w:left="1440"/>
-        <w:rPr>
-          <w:b/>
-        </w:rPr>
-      </w:pPr>
-      <w:r>
-        <w:rPr>
-          <w:b/>
-        </w:rPr>
-        <w:t>Bağış</w:t>
-      </w:r>
-    </w:p>
-    <w:p>
-      <w:pPr>
-        <w:spacing w:after="0" w:line="240" w:lineRule="auto"/>
-        <w:ind w:left="720" w:firstLine="720"/>
-        <w:rPr>
-          <w:b/>
-        </w:rPr>
-      </w:pPr>
-      <w:r>
-        <w:rPr>
-          <w:b/>
-        </w:rPr>
+        <w:t>INSERT INTO Odunc (UyeID, KitapID, OduncAlmaTarih) VALUES</w:t>
+      </w:r>
+    </w:p>
+    <w:p>
+      <w:pPr>
+        <w:pStyle w:val="ListeParagraf"/>
+        <w:spacing w:after="0" w:line="240" w:lineRule="auto"/>
+      </w:pPr>
+      <w:r>
+        <w:t>(1, 1, '2024-11-01'),</w:t>
+      </w:r>
+    </w:p>
+    <w:p>
+      <w:pPr>
+        <w:pStyle w:val="ListeParagraf"/>
+        <w:spacing w:after="0" w:line="240" w:lineRule="auto"/>
+      </w:pPr>
+      <w:r>
+        <w:t>(2, 2, '2024-11-05'),</w:t>
+      </w:r>
+    </w:p>
+    <w:p>
+      <w:pPr>
+        <w:pStyle w:val="ListeParagraf"/>
+        <w:spacing w:after="0" w:line="240" w:lineRule="auto"/>
+      </w:pPr>
+      <w:r>
+        <w:t>(3, 3, '2024-11-07'),</w:t>
+      </w:r>
+    </w:p>
+    <w:p>
+      <w:pPr>
+        <w:pStyle w:val="ListeParagraf"/>
+        <w:spacing w:after="0" w:line="240" w:lineRule="auto"/>
+      </w:pPr>
+      <w:r>
+        <w:t>(4, 4, '2024-11-10'),</w:t>
+      </w:r>
+    </w:p>
+    <w:p>
+      <w:pPr>
+        <w:pStyle w:val="ListeParagraf"/>
+        <w:spacing w:after="0" w:line="240" w:lineRule="auto"/>
+      </w:pPr>
+      <w:r>
+        <w:t>(5, 5, '2024-11-12'),</w:t>
+      </w:r>
+    </w:p>
+    <w:p>
+      <w:pPr>
+        <w:pStyle w:val="ListeParagraf"/>
+        <w:spacing w:after="0" w:line="240" w:lineRule="auto"/>
+      </w:pPr>
+      <w:r>
+        <w:t>(6, 6, '2024-11-13'),</w:t>
+      </w:r>
+    </w:p>
+    <w:p>
+      <w:pPr>
+        <w:pStyle w:val="ListeParagraf"/>
+        <w:spacing w:after="0" w:line="240" w:lineRule="auto"/>
+      </w:pPr>
+      <w:r>
+        <w:t>(7, 7, '2024-11-14'),</w:t>
+      </w:r>
+    </w:p>
+    <w:p>
+      <w:pPr>
+        <w:pStyle w:val="ListeParagraf"/>
+        <w:spacing w:after="0" w:line="240" w:lineRule="auto"/>
+      </w:pPr>
+      <w:r>
+        <w:t>(8, 8, '2024-11-15'),</w:t>
+      </w:r>
+    </w:p>
+    <w:p>
+      <w:pPr>
+        <w:pStyle w:val="ListeParagraf"/>
+        <w:spacing w:after="0" w:line="240" w:lineRule="auto"/>
+      </w:pPr>
+      <w:r>
+        <w:t>(9, 9, '2024-11-16'),</w:t>
+      </w:r>
+    </w:p>
+    <w:p>
+      <w:pPr>
+        <w:pStyle w:val="ListeParagraf"/>
+        <w:spacing w:after="0" w:line="240" w:lineRule="auto"/>
+      </w:pPr>
+      <w:r>
+        <w:t>(10, 10, '2024-11-17');</w:t>
+      </w:r>
+    </w:p>
+    <w:p>
+      <w:pPr>
+        <w:pStyle w:val="ListeParagraf"/>
+        <w:spacing w:after="0" w:line="240" w:lineRule="auto"/>
+        <w:rPr>
+          <w:b/>
+        </w:rPr>
+      </w:pPr>
+    </w:p>
+    <w:p>
+      <w:pPr>
+        <w:pStyle w:val="ListeParagraf"/>
+        <w:spacing w:after="0" w:line="240" w:lineRule="auto"/>
+        <w:rPr>
+          <w:b/>
+        </w:rPr>
+      </w:pPr>
+      <w:r>
+        <w:rPr>
+          <w:b/>
+        </w:rPr>
+        <w:t>INSERT INTO Ceza (OduncID, CezaMiktar) VALUES</w:t>
+      </w:r>
+    </w:p>
+    <w:p>
+      <w:pPr>
+        <w:pStyle w:val="ListeParagraf"/>
+        <w:spacing w:after="0" w:line="240" w:lineRule="auto"/>
+      </w:pPr>
+      <w:r>
+        <w:t>(1, 5.00),</w:t>
+      </w:r>
+    </w:p>
+    <w:p>
+      <w:pPr>
+        <w:pStyle w:val="ListeParagraf"/>
+        <w:spacing w:after="0" w:line="240" w:lineRule="auto"/>
+      </w:pPr>
+      <w:r>
+        <w:t>(2, 10.00),</w:t>
+      </w:r>
+    </w:p>
+    <w:p>
+      <w:pPr>
+        <w:pStyle w:val="ListeParagraf"/>
+        <w:spacing w:after="0" w:line="240" w:lineRule="auto"/>
+      </w:pPr>
+      <w:r>
+        <w:t>(3, 3.00),</w:t>
+      </w:r>
+    </w:p>
+    <w:p>
+      <w:pPr>
+        <w:pStyle w:val="ListeParagraf"/>
+        <w:spacing w:after="0" w:line="240" w:lineRule="auto"/>
+      </w:pPr>
+      <w:r>
+        <w:t>(4, 0.00),</w:t>
+      </w:r>
+    </w:p>
+    <w:p>
+      <w:pPr>
+        <w:pStyle w:val="ListeParagraf"/>
+        <w:spacing w:after="0" w:line="240" w:lineRule="auto"/>
+      </w:pPr>
+      <w:r>
+        <w:t>(5, 0.00),</w:t>
+      </w:r>
+    </w:p>
+    <w:p>
+      <w:pPr>
+        <w:pStyle w:val="ListeParagraf"/>
+        <w:spacing w:after="0" w:line="240" w:lineRule="auto"/>
+      </w:pPr>
+      <w:r>
+        <w:t>(6, 7.00),</w:t>
+      </w:r>
+    </w:p>
+    <w:p>
+      <w:pPr>
+        <w:pStyle w:val="ListeParagraf"/>
+        <w:spacing w:after="0" w:line="240" w:lineRule="auto"/>
+      </w:pPr>
+      <w:r>
+        <w:t>(7, 2.50),</w:t>
+      </w:r>
+    </w:p>
+    <w:p>
+      <w:pPr>
+        <w:pStyle w:val="ListeParagraf"/>
+        <w:spacing w:after="0" w:line="240" w:lineRule="auto"/>
+      </w:pPr>
+      <w:r>
+        <w:t>(8, 1.00),</w:t>
+      </w:r>
+    </w:p>
+    <w:p>
+      <w:pPr>
+        <w:pStyle w:val="ListeParagraf"/>
+        <w:spacing w:after="0" w:line="240" w:lineRule="auto"/>
+      </w:pPr>
+      <w:r>
+        <w:t>(9, 0.00),</w:t>
+      </w:r>
+    </w:p>
+    <w:p>
+      <w:pPr>
+        <w:pStyle w:val="ListeParagraf"/>
+        <w:spacing w:after="0" w:line="240" w:lineRule="auto"/>
+      </w:pPr>
+      <w:r>
+        <w:t>(10, 0.00);</w:t>
+      </w:r>
+    </w:p>
+    <w:p>
+      <w:pPr>
+        <w:pStyle w:val="ListeParagraf"/>
+        <w:spacing w:after="0" w:line="240" w:lineRule="auto"/>
+        <w:rPr>
+          <w:b/>
+        </w:rPr>
+      </w:pPr>
+    </w:p>
+    <w:p>
+      <w:pPr>
+        <w:pStyle w:val="ListeParagraf"/>
+        <w:spacing w:after="0" w:line="240" w:lineRule="auto"/>
+        <w:rPr>
+          <w:b/>
+        </w:rPr>
+      </w:pPr>
+    </w:p>
+    <w:p>
+      <w:pPr>
+        <w:pStyle w:val="ListeParagraf"/>
+        <w:spacing w:after="0" w:line="240" w:lineRule="auto"/>
+        <w:rPr>
+          <w:b/>
+        </w:rPr>
+      </w:pPr>
+      <w:r>
+        <w:rPr>
+          <w:b/>
+        </w:rPr>
+        <w:t>INSERT INTO Rezervasyon (UyeID, KitapID, RezervasyonTarih) VALUES</w:t>
+      </w:r>
+    </w:p>
+    <w:p>
+      <w:pPr>
+        <w:pStyle w:val="ListeParagraf"/>
+        <w:spacing w:after="0" w:line="240" w:lineRule="auto"/>
+      </w:pPr>
+      <w:r>
+        <w:t>(1, 5, '2024-11-01'),</w:t>
+      </w:r>
+    </w:p>
+    <w:p>
+      <w:pPr>
+        <w:pStyle w:val="ListeParagraf"/>
+        <w:spacing w:after="0" w:line="240" w:lineRule="auto"/>
+      </w:pPr>
+      <w:r>
+        <w:t>(2, 6, '2024-11-02'),</w:t>
+      </w:r>
+    </w:p>
+    <w:p>
+      <w:pPr>
+        <w:pStyle w:val="ListeParagraf"/>
+        <w:spacing w:after="0" w:line="240" w:lineRule="auto"/>
+      </w:pPr>
+      <w:r>
+        <w:t>(3, 7, '2024-11-03'),</w:t>
+      </w:r>
+    </w:p>
+    <w:p>
+      <w:pPr>
+        <w:pStyle w:val="ListeParagraf"/>
+        <w:spacing w:after="0" w:line="240" w:lineRule="auto"/>
+      </w:pPr>
+      <w:r>
+        <w:t>(4, 8, '2024-11-04'),</w:t>
+      </w:r>
+    </w:p>
+    <w:p>
+      <w:pPr>
+        <w:pStyle w:val="ListeParagraf"/>
+        <w:spacing w:after="0" w:line="240" w:lineRule="auto"/>
+      </w:pPr>
+      <w:r>
+        <w:t>(5, 9, '2024-11-05'),</w:t>
+      </w:r>
+    </w:p>
+    <w:p>
+      <w:pPr>
+        <w:pStyle w:val="ListeParagraf"/>
+        <w:spacing w:after="0" w:line="240" w:lineRule="auto"/>
+      </w:pPr>
+      <w:r>
+        <w:t>(6, 10, '2024-11-06'),</w:t>
+      </w:r>
+    </w:p>
+    <w:p>
+      <w:pPr>
+        <w:pStyle w:val="ListeParagraf"/>
+        <w:spacing w:after="0" w:line="240" w:lineRule="auto"/>
+      </w:pPr>
+      <w:r>
+        <w:t>(7, 1, '2024-11-07'),</w:t>
+      </w:r>
+    </w:p>
+    <w:p>
+      <w:pPr>
+        <w:pStyle w:val="ListeParagraf"/>
+        <w:spacing w:after="0" w:line="240" w:lineRule="auto"/>
+      </w:pPr>
+      <w:r>
+        <w:t>(8, 2, '2024-11-08'),</w:t>
+      </w:r>
+    </w:p>
+    <w:p>
+      <w:pPr>
+        <w:pStyle w:val="ListeParagraf"/>
+        <w:spacing w:after="0" w:line="240" w:lineRule="auto"/>
+      </w:pPr>
+      <w:r>
+        <w:t>(9, 3, '2024-11-09'),</w:t>
+      </w:r>
+    </w:p>
+    <w:p>
+      <w:pPr>
+        <w:pStyle w:val="ListeParagraf"/>
+        <w:spacing w:after="0" w:line="240" w:lineRule="auto"/>
+      </w:pPr>
+      <w:r>
+        <w:t>(10, 4, '2024-11-10');</w:t>
+      </w:r>
+    </w:p>
+    <w:p>
+      <w:pPr>
+        <w:pStyle w:val="ListeParagraf"/>
+        <w:spacing w:after="0" w:line="240" w:lineRule="auto"/>
+        <w:rPr>
+          <w:b/>
+        </w:rPr>
+      </w:pPr>
+    </w:p>
+    <w:p>
+      <w:pPr>
+        <w:pStyle w:val="ListeParagraf"/>
+        <w:spacing w:after="0" w:line="240" w:lineRule="auto"/>
+        <w:rPr>
+          <w:b/>
+        </w:rPr>
+      </w:pPr>
+      <w:r>
+        <w:rPr>
+          <w:b/>
+        </w:rPr>
+        <w:t>INSERT INTO Bagis (KitapID, BagisTarih) VALUES</w:t>
+      </w:r>
+    </w:p>
+    <w:p>
+      <w:pPr>
+        <w:pStyle w:val="ListeParagraf"/>
+        <w:spacing w:after="0" w:line="240" w:lineRule="auto"/>
+      </w:pPr>
+      <w:r>
+        <w:t>(1, '2024-10-01'),</w:t>
+      </w:r>
+    </w:p>
+    <w:p>
+      <w:pPr>
+        <w:pStyle w:val="ListeParagraf"/>
+        <w:spacing w:after="0" w:line="240" w:lineRule="auto"/>
+      </w:pPr>
+      <w:r>
+        <w:t>(2, '2024-10-05'),</w:t>
+      </w:r>
+    </w:p>
+    <w:p>
+      <w:pPr>
+        <w:pStyle w:val="ListeParagraf"/>
+        <w:spacing w:after="0" w:line="240" w:lineRule="auto"/>
+      </w:pPr>
+      <w:r>
+        <w:t>(3, '2024-10-07'),</w:t>
+      </w:r>
+    </w:p>
+    <w:p>
+      <w:pPr>
+        <w:pStyle w:val="ListeParagraf"/>
+        <w:spacing w:after="0" w:line="240" w:lineRule="auto"/>
+      </w:pPr>
+      <w:r>
+        <w:t>(4, '2024-10-10'),</w:t>
+      </w:r>
+    </w:p>
+    <w:p>
+      <w:pPr>
+        <w:pStyle w:val="ListeParagraf"/>
+        <w:spacing w:after="0" w:line="240" w:lineRule="auto"/>
+      </w:pPr>
+      <w:r>
+        <w:t>(5, '2024-10-12'),</w:t>
+      </w:r>
+    </w:p>
+    <w:p>
+      <w:pPr>
+        <w:pStyle w:val="ListeParagraf"/>
+        <w:spacing w:after="0" w:line="240" w:lineRule="auto"/>
+      </w:pPr>
+      <w:r>
+        <w:t>(6, '2024-10-13'),</w:t>
+      </w:r>
+    </w:p>
+    <w:p>
+      <w:pPr>
+        <w:pStyle w:val="ListeParagraf"/>
+        <w:spacing w:after="0" w:line="240" w:lineRule="auto"/>
+      </w:pPr>
+      <w:r>
+        <w:t>(7, '2024-10-14'),</w:t>
+      </w:r>
+    </w:p>
+    <w:p>
+      <w:pPr>
+        <w:pStyle w:val="ListeParagraf"/>
+        <w:spacing w:after="0" w:line="240" w:lineRule="auto"/>
+      </w:pPr>
+      <w:r>
+        <w:t>(8, '2024-10-15'),</w:t>
+      </w:r>
+    </w:p>
+    <w:p>
+      <w:pPr>
+        <w:pStyle w:val="ListeParagraf"/>
+        <w:spacing w:after="0" w:line="240" w:lineRule="auto"/>
+      </w:pPr>
+      <w:r>
+        <w:t>(9, '2024-10-16'),</w:t>
+      </w:r>
+    </w:p>
+    <w:p>
+      <w:pPr>
+        <w:pStyle w:val="ListeParagraf"/>
+        <w:spacing w:after="0" w:line="240" w:lineRule="auto"/>
+      </w:pPr>
+      <w:r>
+        <w:t>(10, '2024-10-17');</w:t>
+      </w:r>
+    </w:p>
+    <w:p>
+      <w:pPr>
+        <w:spacing w:after="0" w:line="240" w:lineRule="auto"/>
+      </w:pPr>
+      <w:r>
+        <w:lastRenderedPageBreak/>
         <w:pict>
           <v:shapetype id="_x0000_t75" coordsize="21600,21600" o:spt="75" o:preferrelative="t" path="m@4@5l@4@11@9@11@9@5xe" filled="f" stroked="f">
             <v:stroke joinstyle="miter"/>
@@ -2283,15 +3308,15 @@
             <v:path o:extrusionok="f" gradientshapeok="t" o:connecttype="rect"/>
             <o:lock v:ext="edit" aspectratio="t"/>
           </v:shapetype>
-          <v:shape id="_x0000_i1025" type="#_x0000_t75" style="width:386.85pt;height:285.85pt">
-            <v:imagedata r:id="rId16" o:title="Ekran görüntüsü 2024-11-20 124008"/>
+          <v:shape id="_x0000_i1025" type="#_x0000_t75" style="width:466.6pt;height:635.85pt">
+            <v:imagedata r:id="rId7" o:title="ktpguncel.drawio"/>
           </v:shape>
         </w:pict>
       </w:r>
     </w:p>
     <w:sectPr>
-      <w:footerReference w:type="even" r:id="rId17"/>
-      <w:footerReference w:type="default" r:id="rId18"/>
+      <w:footerReference w:type="even" r:id="rId8"/>
+      <w:footerReference w:type="default" r:id="rId9"/>
       <w:pgSz w:w="12240" w:h="15840"/>
       <w:pgMar w:top="1440" w:right="1440" w:bottom="1440" w:left="1440" w:header="720" w:footer="720" w:gutter="0"/>
       <w:cols w:space="720"/>
@@ -2423,7 +3448,7 @@
             <w:rStyle w:val="SayfaNumaras"/>
             <w:noProof/>
           </w:rPr>
-          <w:t>6</w:t>
+          <w:t>4</w:t>
         </w:r>
         <w:r>
           <w:rPr>
@@ -5986,6 +7011,92 @@
     </w:lvl>
   </w:abstractNum>
   <w:abstractNum w:abstractNumId="35">
+    <w:nsid w:val="7AD043ED"/>
+    <w:multiLevelType w:val="hybridMultilevel"/>
+    <w:tmpl w:val="186C3CC4"/>
+    <w:lvl w:ilvl="0" w:tplc="041F000F">
+      <w:start w:val="1"/>
+      <w:numFmt w:val="decimal"/>
+      <w:lvlText w:val="%1."/>
+      <w:lvlJc w:val="left"/>
+      <w:pPr>
+        <w:ind w:left="720" w:hanging="360"/>
+      </w:pPr>
+    </w:lvl>
+    <w:lvl w:ilvl="1" w:tplc="041F0019" w:tentative="1">
+      <w:start w:val="1"/>
+      <w:numFmt w:val="lowerLetter"/>
+      <w:lvlText w:val="%2."/>
+      <w:lvlJc w:val="left"/>
+      <w:pPr>
+        <w:ind w:left="1440" w:hanging="360"/>
+      </w:pPr>
+    </w:lvl>
+    <w:lvl w:ilvl="2" w:tplc="041F001B" w:tentative="1">
+      <w:start w:val="1"/>
+      <w:numFmt w:val="lowerRoman"/>
+      <w:lvlText w:val="%3."/>
+      <w:lvlJc w:val="right"/>
+      <w:pPr>
+        <w:ind w:left="2160" w:hanging="180"/>
+      </w:pPr>
+    </w:lvl>
+    <w:lvl w:ilvl="3" w:tplc="041F000F" w:tentative="1">
+      <w:start w:val="1"/>
+      <w:numFmt w:val="decimal"/>
+      <w:lvlText w:val="%4."/>
+      <w:lvlJc w:val="left"/>
+      <w:pPr>
+        <w:ind w:left="2880" w:hanging="360"/>
+      </w:pPr>
+    </w:lvl>
+    <w:lvl w:ilvl="4" w:tplc="041F0019" w:tentative="1">
+      <w:start w:val="1"/>
+      <w:numFmt w:val="lowerLetter"/>
+      <w:lvlText w:val="%5."/>
+      <w:lvlJc w:val="left"/>
+      <w:pPr>
+        <w:ind w:left="3600" w:hanging="360"/>
+      </w:pPr>
+    </w:lvl>
+    <w:lvl w:ilvl="5" w:tplc="041F001B" w:tentative="1">
+      <w:start w:val="1"/>
+      <w:numFmt w:val="lowerRoman"/>
+      <w:lvlText w:val="%6."/>
+      <w:lvlJc w:val="right"/>
+      <w:pPr>
+        <w:ind w:left="4320" w:hanging="180"/>
+      </w:pPr>
+    </w:lvl>
+    <w:lvl w:ilvl="6" w:tplc="041F000F" w:tentative="1">
+      <w:start w:val="1"/>
+      <w:numFmt w:val="decimal"/>
+      <w:lvlText w:val="%7."/>
+      <w:lvlJc w:val="left"/>
+      <w:pPr>
+        <w:ind w:left="5040" w:hanging="360"/>
+      </w:pPr>
+    </w:lvl>
+    <w:lvl w:ilvl="7" w:tplc="041F0019" w:tentative="1">
+      <w:start w:val="1"/>
+      <w:numFmt w:val="lowerLetter"/>
+      <w:lvlText w:val="%8."/>
+      <w:lvlJc w:val="left"/>
+      <w:pPr>
+        <w:ind w:left="5760" w:hanging="360"/>
+      </w:pPr>
+    </w:lvl>
+    <w:lvl w:ilvl="8" w:tplc="041F001B" w:tentative="1">
+      <w:start w:val="1"/>
+      <w:numFmt w:val="lowerRoman"/>
+      <w:lvlText w:val="%9."/>
+      <w:lvlJc w:val="right"/>
+      <w:pPr>
+        <w:ind w:left="6480" w:hanging="180"/>
+      </w:pPr>
+    </w:lvl>
+  </w:abstractNum>
+  <w:abstractNum w:abstractNumId="36">
     <w:nsid w:val="7C2163D6"/>
     <w:multiLevelType w:val="hybridMultilevel"/>
     <w:tmpl w:val="9222B86C"/>
@@ -6177,10 +7288,13 @@
     <w:abstractNumId w:val="2"/>
   </w:num>
   <w:num w:numId="35">
-    <w:abstractNumId w:val="35"/>
+    <w:abstractNumId w:val="36"/>
   </w:num>
   <w:num w:numId="36">
     <w:abstractNumId w:val="6"/>
+  </w:num>
+  <w:num w:numId="37">
+    <w:abstractNumId w:val="35"/>
   </w:num>
 </w:numbering>
 </file>
@@ -6353,7 +7467,6 @@
   <w:style w:type="character" w:default="1" w:styleId="VarsaylanParagrafYazTipi">
     <w:name w:val="Default Paragraph Font"/>
     <w:uiPriority w:val="1"/>
-    <w:semiHidden/>
     <w:unhideWhenUsed/>
   </w:style>
   <w:style w:type="table" w:default="1" w:styleId="NormalTablo">
@@ -6774,7 +7887,7 @@
   <a:extraClrSchemeLst/>
   <a:extLst>
     <a:ext uri="{05A4C25C-085E-4340-85A3-A5531E510DB2}">
-      <thm15:themeFamily xmlns:thm15="http://schemas.microsoft.com/office/thememl/2012/main" xmlns="" name="Office Theme" id="{62F939B6-93AF-4DB8-9C6B-D6C7DFDC589F}" vid="{4A3C46E8-61CC-4603-A589-7422A47A8E4A}"/>
+      <thm15:themeFamily xmlns="" xmlns:thm15="http://schemas.microsoft.com/office/thememl/2012/main" name="Office Theme" id="{62F939B6-93AF-4DB8-9C6B-D6C7DFDC589F}" vid="{4A3C46E8-61CC-4603-A589-7422A47A8E4A}"/>
     </a:ext>
   </a:extLst>
 </a:theme>

</xml_diff>